<commit_message>
Add use tables to shared example Word doc and all print notebook copies
The shared example_account_tables_print.docx now has 8 tables (was 6):
  Table 0: Extent account
  Table 1: Extent time series
  Table 2: Change matrix (with stable area numbers)
  Table 3: Condition account (6 indicators + composite)
  Table 4: Services physical supply (Part A)
  Table 5: Services monetary supply (Part B)
  Table 6: Services physical USE (Part A) -- NEW: by beneficiary sector
  Table 7: Services monetary USE (Part B) -- NEW: USD/yr by sector

Updated ALL copies in print-notebooks/:
  01-extent (3 copies), 02-condition (3 copies), 03-services (3 copies)

Also regenerated all filled example Word docs for notebooks.

Co-Authored-By: Claude Opus 4.6 (1M context) <noreply@anthropic.com>
</commit_message>
<xml_diff>
--- a/s-s-event-bogor/print-notebooks/01-extent/06-example-tables.docx
+++ b/s-s-event-bogor/print-notebooks/01-extent/06-example-tables.docx
@@ -8801,6 +8801,4250 @@
         </w:tc>
       </w:tr>
     </w:tbl>
+    <w:p>
+      <w:r>
+        <w:br w:type="page"/>
+      </w:r>
+    </w:p>
+    <w:p>
+      <w:pPr>
+        <w:spacing w:before="360" w:after="120"/>
+      </w:pPr>
+      <w:r>
+        <w:rPr>
+          <w:rFonts w:ascii="Arial" w:hAnsi="Arial"/>
+          <w:b/>
+          <w:color w:val="0A5455"/>
+          <w:sz w:val="26"/>
+        </w:rPr>
+        <w:t>Table 4c -- Ecosystem Service Physical Use (Part A): Who Benefits?</w:t>
+      </w:r>
+    </w:p>
+    <w:tbl>
+      <w:tblPr>
+        <w:tblW w:type="auto" w:w="0"/>
+        <w:jc w:val="center"/>
+        <w:tblLook w:firstColumn="1" w:firstRow="1" w:lastColumn="0" w:lastRow="0" w:noHBand="0" w:noVBand="1" w:val="04A0"/>
+      </w:tblPr>
+      <w:tblGrid>
+        <w:gridCol w:w="1767"/>
+        <w:gridCol w:w="1767"/>
+        <w:gridCol w:w="1767"/>
+        <w:gridCol w:w="1767"/>
+        <w:gridCol w:w="1767"/>
+        <w:gridCol w:w="1767"/>
+        <w:gridCol w:w="1767"/>
+        <w:gridCol w:w="1767"/>
+      </w:tblGrid>
+      <w:tr>
+        <w:tc>
+          <w:tcPr>
+            <w:tcW w:type="dxa" w:w="1767"/>
+            <w:tcBorders>
+              <w:top w:val="single" w:sz="8" w:space="0" w:color="404040"/>
+              <w:left w:val="single" w:sz="8" w:space="0" w:color="404040"/>
+              <w:bottom w:val="single" w:sz="8" w:space="0" w:color="404040"/>
+              <w:right w:val="single" w:sz="8" w:space="0" w:color="404040"/>
+            </w:tcBorders>
+            <w:shd w:fill="3B9C7B" w:val="clear"/>
+          </w:tcPr>
+          <w:p>
+            <w:pPr>
+              <w:spacing w:before="80" w:after="80"/>
+              <w:jc w:val="center"/>
+            </w:pPr>
+            <w:r>
+              <w:rPr>
+                <w:rFonts w:ascii="Arial" w:hAnsi="Arial"/>
+                <w:b/>
+                <w:color w:val="FFFFFF"/>
+                <w:sz w:val="20"/>
+              </w:rPr>
+            </w:r>
+            <w:r>
+              <w:rPr>
+                <w:rFonts w:ascii="Arial" w:hAnsi="Arial"/>
+                <w:b/>
+                <w:color w:val="FFFFFF"/>
+                <w:sz w:val="20"/>
+              </w:rPr>
+              <w:t>Service</w:t>
+            </w:r>
+          </w:p>
+        </w:tc>
+        <w:tc>
+          <w:tcPr>
+            <w:tcW w:type="dxa" w:w="1767"/>
+            <w:tcBorders>
+              <w:top w:val="single" w:sz="8" w:space="0" w:color="404040"/>
+              <w:left w:val="single" w:sz="8" w:space="0" w:color="404040"/>
+              <w:bottom w:val="single" w:sz="8" w:space="0" w:color="404040"/>
+              <w:right w:val="single" w:sz="8" w:space="0" w:color="404040"/>
+            </w:tcBorders>
+            <w:shd w:fill="3B9C7B" w:val="clear"/>
+          </w:tcPr>
+          <w:p>
+            <w:pPr>
+              <w:spacing w:before="80" w:after="80"/>
+              <w:jc w:val="center"/>
+            </w:pPr>
+            <w:r>
+              <w:rPr>
+                <w:rFonts w:ascii="Arial" w:hAnsi="Arial"/>
+                <w:b/>
+                <w:color w:val="FFFFFF"/>
+                <w:sz w:val="20"/>
+              </w:rPr>
+            </w:r>
+            <w:r>
+              <w:rPr>
+                <w:rFonts w:ascii="Arial" w:hAnsi="Arial"/>
+                <w:b/>
+                <w:color w:val="FFFFFF"/>
+                <w:sz w:val="20"/>
+              </w:rPr>
+              <w:t>Unit</w:t>
+            </w:r>
+          </w:p>
+        </w:tc>
+        <w:tc>
+          <w:tcPr>
+            <w:tcW w:type="dxa" w:w="1767"/>
+            <w:tcBorders>
+              <w:top w:val="single" w:sz="8" w:space="0" w:color="404040"/>
+              <w:left w:val="single" w:sz="8" w:space="0" w:color="404040"/>
+              <w:bottom w:val="single" w:sz="8" w:space="0" w:color="404040"/>
+              <w:right w:val="single" w:sz="8" w:space="0" w:color="404040"/>
+            </w:tcBorders>
+            <w:shd w:fill="3B9C7B" w:val="clear"/>
+          </w:tcPr>
+          <w:p>
+            <w:pPr>
+              <w:spacing w:before="80" w:after="80"/>
+              <w:jc w:val="center"/>
+            </w:pPr>
+            <w:r>
+              <w:rPr>
+                <w:rFonts w:ascii="Arial" w:hAnsi="Arial"/>
+                <w:b/>
+                <w:color w:val="FFFFFF"/>
+                <w:sz w:val="20"/>
+              </w:rPr>
+            </w:r>
+            <w:r>
+              <w:rPr>
+                <w:rFonts w:ascii="Arial" w:hAnsi="Arial"/>
+                <w:b/>
+                <w:color w:val="FFFFFF"/>
+                <w:sz w:val="20"/>
+              </w:rPr>
+              <w:t>Fisheries</w:t>
+              <w:br/>
+              <w:t>sector</w:t>
+            </w:r>
+          </w:p>
+        </w:tc>
+        <w:tc>
+          <w:tcPr>
+            <w:tcW w:type="dxa" w:w="1767"/>
+            <w:tcBorders>
+              <w:top w:val="single" w:sz="8" w:space="0" w:color="404040"/>
+              <w:left w:val="single" w:sz="8" w:space="0" w:color="404040"/>
+              <w:bottom w:val="single" w:sz="8" w:space="0" w:color="404040"/>
+              <w:right w:val="single" w:sz="8" w:space="0" w:color="404040"/>
+            </w:tcBorders>
+            <w:shd w:fill="3B9C7B" w:val="clear"/>
+          </w:tcPr>
+          <w:p>
+            <w:pPr>
+              <w:spacing w:before="80" w:after="80"/>
+              <w:jc w:val="center"/>
+            </w:pPr>
+            <w:r>
+              <w:rPr>
+                <w:rFonts w:ascii="Arial" w:hAnsi="Arial"/>
+                <w:b/>
+                <w:color w:val="FFFFFF"/>
+                <w:sz w:val="20"/>
+              </w:rPr>
+            </w:r>
+            <w:r>
+              <w:rPr>
+                <w:rFonts w:ascii="Arial" w:hAnsi="Arial"/>
+                <w:b/>
+                <w:color w:val="FFFFFF"/>
+                <w:sz w:val="20"/>
+              </w:rPr>
+              <w:t>Tourism</w:t>
+              <w:br/>
+              <w:t>sector</w:t>
+            </w:r>
+          </w:p>
+        </w:tc>
+        <w:tc>
+          <w:tcPr>
+            <w:tcW w:type="dxa" w:w="1767"/>
+            <w:tcBorders>
+              <w:top w:val="single" w:sz="8" w:space="0" w:color="404040"/>
+              <w:left w:val="single" w:sz="8" w:space="0" w:color="404040"/>
+              <w:bottom w:val="single" w:sz="8" w:space="0" w:color="404040"/>
+              <w:right w:val="single" w:sz="8" w:space="0" w:color="404040"/>
+            </w:tcBorders>
+            <w:shd w:fill="3B9C7B" w:val="clear"/>
+          </w:tcPr>
+          <w:p>
+            <w:pPr>
+              <w:spacing w:before="80" w:after="80"/>
+              <w:jc w:val="center"/>
+            </w:pPr>
+            <w:r>
+              <w:rPr>
+                <w:rFonts w:ascii="Arial" w:hAnsi="Arial"/>
+                <w:b/>
+                <w:color w:val="FFFFFF"/>
+                <w:sz w:val="20"/>
+              </w:rPr>
+            </w:r>
+            <w:r>
+              <w:rPr>
+                <w:rFonts w:ascii="Arial" w:hAnsi="Arial"/>
+                <w:b/>
+                <w:color w:val="FFFFFF"/>
+                <w:sz w:val="20"/>
+              </w:rPr>
+              <w:t>Coastal</w:t>
+              <w:br/>
+              <w:t>households</w:t>
+            </w:r>
+          </w:p>
+        </w:tc>
+        <w:tc>
+          <w:tcPr>
+            <w:tcW w:type="dxa" w:w="1767"/>
+            <w:tcBorders>
+              <w:top w:val="single" w:sz="8" w:space="0" w:color="404040"/>
+              <w:left w:val="single" w:sz="8" w:space="0" w:color="404040"/>
+              <w:bottom w:val="single" w:sz="8" w:space="0" w:color="404040"/>
+              <w:right w:val="single" w:sz="8" w:space="0" w:color="404040"/>
+            </w:tcBorders>
+            <w:shd w:fill="3B9C7B" w:val="clear"/>
+          </w:tcPr>
+          <w:p>
+            <w:pPr>
+              <w:spacing w:before="80" w:after="80"/>
+              <w:jc w:val="center"/>
+            </w:pPr>
+            <w:r>
+              <w:rPr>
+                <w:rFonts w:ascii="Arial" w:hAnsi="Arial"/>
+                <w:b/>
+                <w:color w:val="FFFFFF"/>
+                <w:sz w:val="20"/>
+              </w:rPr>
+            </w:r>
+            <w:r>
+              <w:rPr>
+                <w:rFonts w:ascii="Arial" w:hAnsi="Arial"/>
+                <w:b/>
+                <w:color w:val="FFFFFF"/>
+                <w:sz w:val="20"/>
+              </w:rPr>
+              <w:t>Government</w:t>
+            </w:r>
+          </w:p>
+        </w:tc>
+        <w:tc>
+          <w:tcPr>
+            <w:tcW w:type="dxa" w:w="1767"/>
+            <w:tcBorders>
+              <w:top w:val="single" w:sz="8" w:space="0" w:color="404040"/>
+              <w:left w:val="single" w:sz="8" w:space="0" w:color="404040"/>
+              <w:bottom w:val="single" w:sz="8" w:space="0" w:color="404040"/>
+              <w:right w:val="single" w:sz="8" w:space="0" w:color="404040"/>
+            </w:tcBorders>
+            <w:shd w:fill="3B9C7B" w:val="clear"/>
+          </w:tcPr>
+          <w:p>
+            <w:pPr>
+              <w:spacing w:before="80" w:after="80"/>
+              <w:jc w:val="center"/>
+            </w:pPr>
+            <w:r>
+              <w:rPr>
+                <w:rFonts w:ascii="Arial" w:hAnsi="Arial"/>
+                <w:b/>
+                <w:color w:val="FFFFFF"/>
+                <w:sz w:val="20"/>
+              </w:rPr>
+            </w:r>
+            <w:r>
+              <w:rPr>
+                <w:rFonts w:ascii="Arial" w:hAnsi="Arial"/>
+                <w:b/>
+                <w:color w:val="FFFFFF"/>
+                <w:sz w:val="20"/>
+              </w:rPr>
+              <w:t>Global</w:t>
+              <w:br/>
+              <w:t>community</w:t>
+            </w:r>
+          </w:p>
+        </w:tc>
+        <w:tc>
+          <w:tcPr>
+            <w:tcW w:type="dxa" w:w="1767"/>
+            <w:tcBorders>
+              <w:top w:val="single" w:sz="8" w:space="0" w:color="404040"/>
+              <w:left w:val="single" w:sz="8" w:space="0" w:color="404040"/>
+              <w:bottom w:val="single" w:sz="8" w:space="0" w:color="404040"/>
+              <w:right w:val="single" w:sz="8" w:space="0" w:color="404040"/>
+            </w:tcBorders>
+            <w:shd w:fill="3B9C7B" w:val="clear"/>
+          </w:tcPr>
+          <w:p>
+            <w:pPr>
+              <w:spacing w:before="80" w:after="80"/>
+              <w:jc w:val="center"/>
+            </w:pPr>
+            <w:r>
+              <w:rPr>
+                <w:rFonts w:ascii="Arial" w:hAnsi="Arial"/>
+                <w:b/>
+                <w:color w:val="FFFFFF"/>
+                <w:sz w:val="20"/>
+              </w:rPr>
+            </w:r>
+            <w:r>
+              <w:rPr>
+                <w:rFonts w:ascii="Arial" w:hAnsi="Arial"/>
+                <w:b/>
+                <w:color w:val="FFFFFF"/>
+                <w:sz w:val="20"/>
+              </w:rPr>
+              <w:t>Total</w:t>
+            </w:r>
+          </w:p>
+        </w:tc>
+      </w:tr>
+      <w:tr>
+        <w:tc>
+          <w:tcPr>
+            <w:tcW w:type="dxa" w:w="1767"/>
+            <w:tcBorders>
+              <w:top w:val="single" w:sz="8" w:space="0" w:color="404040"/>
+              <w:left w:val="single" w:sz="8" w:space="0" w:color="404040"/>
+              <w:bottom w:val="single" w:sz="8" w:space="0" w:color="404040"/>
+              <w:right w:val="single" w:sz="8" w:space="0" w:color="404040"/>
+            </w:tcBorders>
+            <w:shd w:fill="0A5455" w:val="clear"/>
+          </w:tcPr>
+          <w:p>
+            <w:pPr>
+              <w:spacing w:before="80" w:after="80"/>
+              <w:jc w:val="left"/>
+            </w:pPr>
+            <w:r>
+              <w:rPr>
+                <w:rFonts w:ascii="Arial" w:hAnsi="Arial"/>
+                <w:b/>
+                <w:color w:val="FFFFFF"/>
+                <w:sz w:val="20"/>
+              </w:rPr>
+            </w:r>
+            <w:r>
+              <w:rPr>
+                <w:rFonts w:ascii="Arial" w:hAnsi="Arial"/>
+                <w:b/>
+                <w:color w:val="FFFFFF"/>
+                <w:sz w:val="20"/>
+              </w:rPr>
+              <w:t>Fish provisioning</w:t>
+            </w:r>
+          </w:p>
+        </w:tc>
+        <w:tc>
+          <w:tcPr>
+            <w:tcW w:type="dxa" w:w="1767"/>
+            <w:tcBorders>
+              <w:top w:val="single" w:sz="8" w:space="0" w:color="404040"/>
+              <w:left w:val="single" w:sz="8" w:space="0" w:color="404040"/>
+              <w:bottom w:val="single" w:sz="8" w:space="0" w:color="404040"/>
+              <w:right w:val="single" w:sz="8" w:space="0" w:color="404040"/>
+            </w:tcBorders>
+          </w:tcPr>
+          <w:p>
+            <w:pPr>
+              <w:spacing w:before="80" w:after="80"/>
+              <w:jc w:val="center"/>
+            </w:pPr>
+            <w:r>
+              <w:rPr>
+                <w:rFonts w:ascii="Arial" w:hAnsi="Arial"/>
+                <w:b w:val="0"/>
+                <w:color w:val="30302F"/>
+                <w:sz w:val="20"/>
+              </w:rPr>
+            </w:r>
+            <w:r>
+              <w:rPr>
+                <w:rFonts w:ascii="Arial" w:hAnsi="Arial"/>
+                <w:b w:val="0"/>
+                <w:color w:val="30302F"/>
+                <w:sz w:val="20"/>
+              </w:rPr>
+              <w:t>kg/yr</w:t>
+            </w:r>
+          </w:p>
+        </w:tc>
+        <w:tc>
+          <w:tcPr>
+            <w:tcW w:type="dxa" w:w="1767"/>
+            <w:tcBorders>
+              <w:top w:val="single" w:sz="8" w:space="0" w:color="404040"/>
+              <w:left w:val="single" w:sz="8" w:space="0" w:color="404040"/>
+              <w:bottom w:val="single" w:sz="8" w:space="0" w:color="404040"/>
+              <w:right w:val="single" w:sz="8" w:space="0" w:color="404040"/>
+            </w:tcBorders>
+          </w:tcPr>
+          <w:p>
+            <w:pPr>
+              <w:spacing w:before="80" w:after="80"/>
+              <w:jc w:val="center"/>
+            </w:pPr>
+            <w:r>
+              <w:rPr>
+                <w:rFonts w:ascii="Arial" w:hAnsi="Arial"/>
+                <w:b w:val="0"/>
+                <w:color w:val="30302F"/>
+                <w:sz w:val="20"/>
+              </w:rPr>
+            </w:r>
+            <w:r>
+              <w:rPr>
+                <w:rFonts w:ascii="Arial" w:hAnsi="Arial"/>
+                <w:b w:val="0"/>
+                <w:color w:val="30302F"/>
+                <w:sz w:val="20"/>
+              </w:rPr>
+              <w:t>180 000</w:t>
+            </w:r>
+          </w:p>
+        </w:tc>
+        <w:tc>
+          <w:tcPr>
+            <w:tcW w:type="dxa" w:w="1767"/>
+            <w:tcBorders>
+              <w:top w:val="single" w:sz="8" w:space="0" w:color="404040"/>
+              <w:left w:val="single" w:sz="8" w:space="0" w:color="404040"/>
+              <w:bottom w:val="single" w:sz="8" w:space="0" w:color="404040"/>
+              <w:right w:val="single" w:sz="8" w:space="0" w:color="404040"/>
+            </w:tcBorders>
+          </w:tcPr>
+          <w:p>
+            <w:pPr>
+              <w:spacing w:before="80" w:after="80"/>
+              <w:jc w:val="center"/>
+            </w:pPr>
+            <w:r>
+              <w:rPr>
+                <w:rFonts w:ascii="Arial" w:hAnsi="Arial"/>
+                <w:b w:val="0"/>
+                <w:color w:val="30302F"/>
+                <w:sz w:val="20"/>
+              </w:rPr>
+            </w:r>
+            <w:r>
+              <w:rPr>
+                <w:rFonts w:ascii="Arial" w:hAnsi="Arial"/>
+                <w:b w:val="0"/>
+                <w:color w:val="30302F"/>
+                <w:sz w:val="20"/>
+              </w:rPr>
+              <w:t>0</w:t>
+            </w:r>
+          </w:p>
+        </w:tc>
+        <w:tc>
+          <w:tcPr>
+            <w:tcW w:type="dxa" w:w="1767"/>
+            <w:tcBorders>
+              <w:top w:val="single" w:sz="8" w:space="0" w:color="404040"/>
+              <w:left w:val="single" w:sz="8" w:space="0" w:color="404040"/>
+              <w:bottom w:val="single" w:sz="8" w:space="0" w:color="404040"/>
+              <w:right w:val="single" w:sz="8" w:space="0" w:color="404040"/>
+            </w:tcBorders>
+          </w:tcPr>
+          <w:p>
+            <w:pPr>
+              <w:spacing w:before="80" w:after="80"/>
+              <w:jc w:val="center"/>
+            </w:pPr>
+            <w:r>
+              <w:rPr>
+                <w:rFonts w:ascii="Arial" w:hAnsi="Arial"/>
+                <w:b w:val="0"/>
+                <w:color w:val="30302F"/>
+                <w:sz w:val="20"/>
+              </w:rPr>
+            </w:r>
+            <w:r>
+              <w:rPr>
+                <w:rFonts w:ascii="Arial" w:hAnsi="Arial"/>
+                <w:b w:val="0"/>
+                <w:color w:val="30302F"/>
+                <w:sz w:val="20"/>
+              </w:rPr>
+              <w:t>0</w:t>
+            </w:r>
+          </w:p>
+        </w:tc>
+        <w:tc>
+          <w:tcPr>
+            <w:tcW w:type="dxa" w:w="1767"/>
+            <w:tcBorders>
+              <w:top w:val="single" w:sz="8" w:space="0" w:color="404040"/>
+              <w:left w:val="single" w:sz="8" w:space="0" w:color="404040"/>
+              <w:bottom w:val="single" w:sz="8" w:space="0" w:color="404040"/>
+              <w:right w:val="single" w:sz="8" w:space="0" w:color="404040"/>
+            </w:tcBorders>
+          </w:tcPr>
+          <w:p>
+            <w:pPr>
+              <w:spacing w:before="80" w:after="80"/>
+              <w:jc w:val="center"/>
+            </w:pPr>
+            <w:r>
+              <w:rPr>
+                <w:rFonts w:ascii="Arial" w:hAnsi="Arial"/>
+                <w:b w:val="0"/>
+                <w:color w:val="30302F"/>
+                <w:sz w:val="20"/>
+              </w:rPr>
+            </w:r>
+            <w:r>
+              <w:rPr>
+                <w:rFonts w:ascii="Arial" w:hAnsi="Arial"/>
+                <w:b w:val="0"/>
+                <w:color w:val="30302F"/>
+                <w:sz w:val="20"/>
+              </w:rPr>
+              <w:t>0</w:t>
+            </w:r>
+          </w:p>
+        </w:tc>
+        <w:tc>
+          <w:tcPr>
+            <w:tcW w:type="dxa" w:w="1767"/>
+            <w:tcBorders>
+              <w:top w:val="single" w:sz="8" w:space="0" w:color="404040"/>
+              <w:left w:val="single" w:sz="8" w:space="0" w:color="404040"/>
+              <w:bottom w:val="single" w:sz="8" w:space="0" w:color="404040"/>
+              <w:right w:val="single" w:sz="8" w:space="0" w:color="404040"/>
+            </w:tcBorders>
+          </w:tcPr>
+          <w:p>
+            <w:pPr>
+              <w:spacing w:before="80" w:after="80"/>
+              <w:jc w:val="center"/>
+            </w:pPr>
+            <w:r>
+              <w:rPr>
+                <w:rFonts w:ascii="Arial" w:hAnsi="Arial"/>
+                <w:b w:val="0"/>
+                <w:color w:val="30302F"/>
+                <w:sz w:val="20"/>
+              </w:rPr>
+            </w:r>
+            <w:r>
+              <w:rPr>
+                <w:rFonts w:ascii="Arial" w:hAnsi="Arial"/>
+                <w:b w:val="0"/>
+                <w:color w:val="30302F"/>
+                <w:sz w:val="20"/>
+              </w:rPr>
+              <w:t>0</w:t>
+            </w:r>
+          </w:p>
+        </w:tc>
+        <w:tc>
+          <w:tcPr>
+            <w:tcW w:type="dxa" w:w="1767"/>
+            <w:tcBorders>
+              <w:top w:val="single" w:sz="8" w:space="0" w:color="404040"/>
+              <w:left w:val="single" w:sz="8" w:space="0" w:color="404040"/>
+              <w:bottom w:val="single" w:sz="8" w:space="0" w:color="404040"/>
+              <w:right w:val="single" w:sz="8" w:space="0" w:color="404040"/>
+            </w:tcBorders>
+          </w:tcPr>
+          <w:p>
+            <w:pPr>
+              <w:spacing w:before="80" w:after="80"/>
+              <w:jc w:val="center"/>
+            </w:pPr>
+            <w:r>
+              <w:rPr>
+                <w:rFonts w:ascii="Arial" w:hAnsi="Arial"/>
+                <w:b w:val="0"/>
+                <w:color w:val="30302F"/>
+                <w:sz w:val="20"/>
+              </w:rPr>
+            </w:r>
+            <w:r>
+              <w:rPr>
+                <w:rFonts w:ascii="Arial" w:hAnsi="Arial"/>
+                <w:b w:val="0"/>
+                <w:color w:val="30302F"/>
+                <w:sz w:val="20"/>
+              </w:rPr>
+              <w:t>180 000</w:t>
+            </w:r>
+          </w:p>
+        </w:tc>
+      </w:tr>
+      <w:tr>
+        <w:tc>
+          <w:tcPr>
+            <w:tcW w:type="dxa" w:w="1767"/>
+            <w:tcBorders>
+              <w:top w:val="single" w:sz="8" w:space="0" w:color="404040"/>
+              <w:left w:val="single" w:sz="8" w:space="0" w:color="404040"/>
+              <w:bottom w:val="single" w:sz="8" w:space="0" w:color="404040"/>
+              <w:right w:val="single" w:sz="8" w:space="0" w:color="404040"/>
+            </w:tcBorders>
+            <w:shd w:fill="0A5455" w:val="clear"/>
+          </w:tcPr>
+          <w:p>
+            <w:pPr>
+              <w:spacing w:before="80" w:after="80"/>
+              <w:jc w:val="left"/>
+            </w:pPr>
+            <w:r>
+              <w:rPr>
+                <w:rFonts w:ascii="Arial" w:hAnsi="Arial"/>
+                <w:b/>
+                <w:color w:val="FFFFFF"/>
+                <w:sz w:val="20"/>
+              </w:rPr>
+            </w:r>
+            <w:r>
+              <w:rPr>
+                <w:rFonts w:ascii="Arial" w:hAnsi="Arial"/>
+                <w:b/>
+                <w:color w:val="FFFFFF"/>
+                <w:sz w:val="20"/>
+              </w:rPr>
+              <w:t>Carbon sequestration</w:t>
+            </w:r>
+          </w:p>
+        </w:tc>
+        <w:tc>
+          <w:tcPr>
+            <w:tcW w:type="dxa" w:w="1767"/>
+            <w:tcBorders>
+              <w:top w:val="single" w:sz="8" w:space="0" w:color="404040"/>
+              <w:left w:val="single" w:sz="8" w:space="0" w:color="404040"/>
+              <w:bottom w:val="single" w:sz="8" w:space="0" w:color="404040"/>
+              <w:right w:val="single" w:sz="8" w:space="0" w:color="404040"/>
+            </w:tcBorders>
+          </w:tcPr>
+          <w:p>
+            <w:pPr>
+              <w:spacing w:before="80" w:after="80"/>
+              <w:jc w:val="center"/>
+            </w:pPr>
+            <w:r>
+              <w:rPr>
+                <w:rFonts w:ascii="Arial" w:hAnsi="Arial"/>
+                <w:b w:val="0"/>
+                <w:color w:val="30302F"/>
+                <w:sz w:val="20"/>
+              </w:rPr>
+            </w:r>
+            <w:r>
+              <w:rPr>
+                <w:rFonts w:ascii="Arial" w:hAnsi="Arial"/>
+                <w:b w:val="0"/>
+                <w:color w:val="30302F"/>
+                <w:sz w:val="20"/>
+              </w:rPr>
+              <w:t>Mg CO2/yr</w:t>
+            </w:r>
+          </w:p>
+        </w:tc>
+        <w:tc>
+          <w:tcPr>
+            <w:tcW w:type="dxa" w:w="1767"/>
+            <w:tcBorders>
+              <w:top w:val="single" w:sz="8" w:space="0" w:color="404040"/>
+              <w:left w:val="single" w:sz="8" w:space="0" w:color="404040"/>
+              <w:bottom w:val="single" w:sz="8" w:space="0" w:color="404040"/>
+              <w:right w:val="single" w:sz="8" w:space="0" w:color="404040"/>
+            </w:tcBorders>
+          </w:tcPr>
+          <w:p>
+            <w:pPr>
+              <w:spacing w:before="80" w:after="80"/>
+              <w:jc w:val="center"/>
+            </w:pPr>
+            <w:r>
+              <w:rPr>
+                <w:rFonts w:ascii="Arial" w:hAnsi="Arial"/>
+                <w:b w:val="0"/>
+                <w:color w:val="30302F"/>
+                <w:sz w:val="20"/>
+              </w:rPr>
+            </w:r>
+            <w:r>
+              <w:rPr>
+                <w:rFonts w:ascii="Arial" w:hAnsi="Arial"/>
+                <w:b w:val="0"/>
+                <w:color w:val="30302F"/>
+                <w:sz w:val="20"/>
+              </w:rPr>
+              <w:t>0</w:t>
+            </w:r>
+          </w:p>
+        </w:tc>
+        <w:tc>
+          <w:tcPr>
+            <w:tcW w:type="dxa" w:w="1767"/>
+            <w:tcBorders>
+              <w:top w:val="single" w:sz="8" w:space="0" w:color="404040"/>
+              <w:left w:val="single" w:sz="8" w:space="0" w:color="404040"/>
+              <w:bottom w:val="single" w:sz="8" w:space="0" w:color="404040"/>
+              <w:right w:val="single" w:sz="8" w:space="0" w:color="404040"/>
+            </w:tcBorders>
+          </w:tcPr>
+          <w:p>
+            <w:pPr>
+              <w:spacing w:before="80" w:after="80"/>
+              <w:jc w:val="center"/>
+            </w:pPr>
+            <w:r>
+              <w:rPr>
+                <w:rFonts w:ascii="Arial" w:hAnsi="Arial"/>
+                <w:b w:val="0"/>
+                <w:color w:val="30302F"/>
+                <w:sz w:val="20"/>
+              </w:rPr>
+            </w:r>
+            <w:r>
+              <w:rPr>
+                <w:rFonts w:ascii="Arial" w:hAnsi="Arial"/>
+                <w:b w:val="0"/>
+                <w:color w:val="30302F"/>
+                <w:sz w:val="20"/>
+              </w:rPr>
+              <w:t>0</w:t>
+            </w:r>
+          </w:p>
+        </w:tc>
+        <w:tc>
+          <w:tcPr>
+            <w:tcW w:type="dxa" w:w="1767"/>
+            <w:tcBorders>
+              <w:top w:val="single" w:sz="8" w:space="0" w:color="404040"/>
+              <w:left w:val="single" w:sz="8" w:space="0" w:color="404040"/>
+              <w:bottom w:val="single" w:sz="8" w:space="0" w:color="404040"/>
+              <w:right w:val="single" w:sz="8" w:space="0" w:color="404040"/>
+            </w:tcBorders>
+          </w:tcPr>
+          <w:p>
+            <w:pPr>
+              <w:spacing w:before="80" w:after="80"/>
+              <w:jc w:val="center"/>
+            </w:pPr>
+            <w:r>
+              <w:rPr>
+                <w:rFonts w:ascii="Arial" w:hAnsi="Arial"/>
+                <w:b w:val="0"/>
+                <w:color w:val="30302F"/>
+                <w:sz w:val="20"/>
+              </w:rPr>
+            </w:r>
+            <w:r>
+              <w:rPr>
+                <w:rFonts w:ascii="Arial" w:hAnsi="Arial"/>
+                <w:b w:val="0"/>
+                <w:color w:val="30302F"/>
+                <w:sz w:val="20"/>
+              </w:rPr>
+              <w:t>0</w:t>
+            </w:r>
+          </w:p>
+        </w:tc>
+        <w:tc>
+          <w:tcPr>
+            <w:tcW w:type="dxa" w:w="1767"/>
+            <w:tcBorders>
+              <w:top w:val="single" w:sz="8" w:space="0" w:color="404040"/>
+              <w:left w:val="single" w:sz="8" w:space="0" w:color="404040"/>
+              <w:bottom w:val="single" w:sz="8" w:space="0" w:color="404040"/>
+              <w:right w:val="single" w:sz="8" w:space="0" w:color="404040"/>
+            </w:tcBorders>
+          </w:tcPr>
+          <w:p>
+            <w:pPr>
+              <w:spacing w:before="80" w:after="80"/>
+              <w:jc w:val="center"/>
+            </w:pPr>
+            <w:r>
+              <w:rPr>
+                <w:rFonts w:ascii="Arial" w:hAnsi="Arial"/>
+                <w:b w:val="0"/>
+                <w:color w:val="30302F"/>
+                <w:sz w:val="20"/>
+              </w:rPr>
+            </w:r>
+            <w:r>
+              <w:rPr>
+                <w:rFonts w:ascii="Arial" w:hAnsi="Arial"/>
+                <w:b w:val="0"/>
+                <w:color w:val="30302F"/>
+                <w:sz w:val="20"/>
+              </w:rPr>
+              <w:t>0</w:t>
+            </w:r>
+          </w:p>
+        </w:tc>
+        <w:tc>
+          <w:tcPr>
+            <w:tcW w:type="dxa" w:w="1767"/>
+            <w:tcBorders>
+              <w:top w:val="single" w:sz="8" w:space="0" w:color="404040"/>
+              <w:left w:val="single" w:sz="8" w:space="0" w:color="404040"/>
+              <w:bottom w:val="single" w:sz="8" w:space="0" w:color="404040"/>
+              <w:right w:val="single" w:sz="8" w:space="0" w:color="404040"/>
+            </w:tcBorders>
+          </w:tcPr>
+          <w:p>
+            <w:pPr>
+              <w:spacing w:before="80" w:after="80"/>
+              <w:jc w:val="center"/>
+            </w:pPr>
+            <w:r>
+              <w:rPr>
+                <w:rFonts w:ascii="Arial" w:hAnsi="Arial"/>
+                <w:b w:val="0"/>
+                <w:color w:val="30302F"/>
+                <w:sz w:val="20"/>
+              </w:rPr>
+            </w:r>
+            <w:r>
+              <w:rPr>
+                <w:rFonts w:ascii="Arial" w:hAnsi="Arial"/>
+                <w:b w:val="0"/>
+                <w:color w:val="30302F"/>
+                <w:sz w:val="20"/>
+              </w:rPr>
+              <w:t>2 335</w:t>
+            </w:r>
+          </w:p>
+        </w:tc>
+        <w:tc>
+          <w:tcPr>
+            <w:tcW w:type="dxa" w:w="1767"/>
+            <w:tcBorders>
+              <w:top w:val="single" w:sz="8" w:space="0" w:color="404040"/>
+              <w:left w:val="single" w:sz="8" w:space="0" w:color="404040"/>
+              <w:bottom w:val="single" w:sz="8" w:space="0" w:color="404040"/>
+              <w:right w:val="single" w:sz="8" w:space="0" w:color="404040"/>
+            </w:tcBorders>
+          </w:tcPr>
+          <w:p>
+            <w:pPr>
+              <w:spacing w:before="80" w:after="80"/>
+              <w:jc w:val="center"/>
+            </w:pPr>
+            <w:r>
+              <w:rPr>
+                <w:rFonts w:ascii="Arial" w:hAnsi="Arial"/>
+                <w:b w:val="0"/>
+                <w:color w:val="30302F"/>
+                <w:sz w:val="20"/>
+              </w:rPr>
+            </w:r>
+            <w:r>
+              <w:rPr>
+                <w:rFonts w:ascii="Arial" w:hAnsi="Arial"/>
+                <w:b w:val="0"/>
+                <w:color w:val="30302F"/>
+                <w:sz w:val="20"/>
+              </w:rPr>
+              <w:t>2 335</w:t>
+            </w:r>
+          </w:p>
+        </w:tc>
+      </w:tr>
+      <w:tr>
+        <w:tc>
+          <w:tcPr>
+            <w:tcW w:type="dxa" w:w="1767"/>
+            <w:tcBorders>
+              <w:top w:val="single" w:sz="8" w:space="0" w:color="404040"/>
+              <w:left w:val="single" w:sz="8" w:space="0" w:color="404040"/>
+              <w:bottom w:val="single" w:sz="8" w:space="0" w:color="404040"/>
+              <w:right w:val="single" w:sz="8" w:space="0" w:color="404040"/>
+            </w:tcBorders>
+            <w:shd w:fill="0A5455" w:val="clear"/>
+          </w:tcPr>
+          <w:p>
+            <w:pPr>
+              <w:spacing w:before="80" w:after="80"/>
+              <w:jc w:val="left"/>
+            </w:pPr>
+            <w:r>
+              <w:rPr>
+                <w:rFonts w:ascii="Arial" w:hAnsi="Arial"/>
+                <w:b/>
+                <w:color w:val="FFFFFF"/>
+                <w:sz w:val="20"/>
+              </w:rPr>
+            </w:r>
+            <w:r>
+              <w:rPr>
+                <w:rFonts w:ascii="Arial" w:hAnsi="Arial"/>
+                <w:b/>
+                <w:color w:val="FFFFFF"/>
+                <w:sz w:val="20"/>
+              </w:rPr>
+              <w:t>Coastal protection</w:t>
+            </w:r>
+          </w:p>
+        </w:tc>
+        <w:tc>
+          <w:tcPr>
+            <w:tcW w:type="dxa" w:w="1767"/>
+            <w:tcBorders>
+              <w:top w:val="single" w:sz="8" w:space="0" w:color="404040"/>
+              <w:left w:val="single" w:sz="8" w:space="0" w:color="404040"/>
+              <w:bottom w:val="single" w:sz="8" w:space="0" w:color="404040"/>
+              <w:right w:val="single" w:sz="8" w:space="0" w:color="404040"/>
+            </w:tcBorders>
+          </w:tcPr>
+          <w:p>
+            <w:pPr>
+              <w:spacing w:before="80" w:after="80"/>
+              <w:jc w:val="center"/>
+            </w:pPr>
+            <w:r>
+              <w:rPr>
+                <w:rFonts w:ascii="Arial" w:hAnsi="Arial"/>
+                <w:b w:val="0"/>
+                <w:color w:val="30302F"/>
+                <w:sz w:val="20"/>
+              </w:rPr>
+            </w:r>
+            <w:r>
+              <w:rPr>
+                <w:rFonts w:ascii="Arial" w:hAnsi="Arial"/>
+                <w:b w:val="0"/>
+                <w:color w:val="30302F"/>
+                <w:sz w:val="20"/>
+              </w:rPr>
+              <w:t>m coastline</w:t>
+            </w:r>
+          </w:p>
+        </w:tc>
+        <w:tc>
+          <w:tcPr>
+            <w:tcW w:type="dxa" w:w="1767"/>
+            <w:tcBorders>
+              <w:top w:val="single" w:sz="8" w:space="0" w:color="404040"/>
+              <w:left w:val="single" w:sz="8" w:space="0" w:color="404040"/>
+              <w:bottom w:val="single" w:sz="8" w:space="0" w:color="404040"/>
+              <w:right w:val="single" w:sz="8" w:space="0" w:color="404040"/>
+            </w:tcBorders>
+          </w:tcPr>
+          <w:p>
+            <w:pPr>
+              <w:spacing w:before="80" w:after="80"/>
+              <w:jc w:val="center"/>
+            </w:pPr>
+            <w:r>
+              <w:rPr>
+                <w:rFonts w:ascii="Arial" w:hAnsi="Arial"/>
+                <w:b w:val="0"/>
+                <w:color w:val="30302F"/>
+                <w:sz w:val="20"/>
+              </w:rPr>
+            </w:r>
+            <w:r>
+              <w:rPr>
+                <w:rFonts w:ascii="Arial" w:hAnsi="Arial"/>
+                <w:b w:val="0"/>
+                <w:color w:val="30302F"/>
+                <w:sz w:val="20"/>
+              </w:rPr>
+              <w:t>0</w:t>
+            </w:r>
+          </w:p>
+        </w:tc>
+        <w:tc>
+          <w:tcPr>
+            <w:tcW w:type="dxa" w:w="1767"/>
+            <w:tcBorders>
+              <w:top w:val="single" w:sz="8" w:space="0" w:color="404040"/>
+              <w:left w:val="single" w:sz="8" w:space="0" w:color="404040"/>
+              <w:bottom w:val="single" w:sz="8" w:space="0" w:color="404040"/>
+              <w:right w:val="single" w:sz="8" w:space="0" w:color="404040"/>
+            </w:tcBorders>
+          </w:tcPr>
+          <w:p>
+            <w:pPr>
+              <w:spacing w:before="80" w:after="80"/>
+              <w:jc w:val="center"/>
+            </w:pPr>
+            <w:r>
+              <w:rPr>
+                <w:rFonts w:ascii="Arial" w:hAnsi="Arial"/>
+                <w:b w:val="0"/>
+                <w:color w:val="30302F"/>
+                <w:sz w:val="20"/>
+              </w:rPr>
+            </w:r>
+            <w:r>
+              <w:rPr>
+                <w:rFonts w:ascii="Arial" w:hAnsi="Arial"/>
+                <w:b w:val="0"/>
+                <w:color w:val="30302F"/>
+                <w:sz w:val="20"/>
+              </w:rPr>
+              <w:t>0</w:t>
+            </w:r>
+          </w:p>
+        </w:tc>
+        <w:tc>
+          <w:tcPr>
+            <w:tcW w:type="dxa" w:w="1767"/>
+            <w:tcBorders>
+              <w:top w:val="single" w:sz="8" w:space="0" w:color="404040"/>
+              <w:left w:val="single" w:sz="8" w:space="0" w:color="404040"/>
+              <w:bottom w:val="single" w:sz="8" w:space="0" w:color="404040"/>
+              <w:right w:val="single" w:sz="8" w:space="0" w:color="404040"/>
+            </w:tcBorders>
+          </w:tcPr>
+          <w:p>
+            <w:pPr>
+              <w:spacing w:before="80" w:after="80"/>
+              <w:jc w:val="center"/>
+            </w:pPr>
+            <w:r>
+              <w:rPr>
+                <w:rFonts w:ascii="Arial" w:hAnsi="Arial"/>
+                <w:b w:val="0"/>
+                <w:color w:val="30302F"/>
+                <w:sz w:val="20"/>
+              </w:rPr>
+            </w:r>
+            <w:r>
+              <w:rPr>
+                <w:rFonts w:ascii="Arial" w:hAnsi="Arial"/>
+                <w:b w:val="0"/>
+                <w:color w:val="30302F"/>
+                <w:sz w:val="20"/>
+              </w:rPr>
+              <w:t>10 000</w:t>
+            </w:r>
+          </w:p>
+        </w:tc>
+        <w:tc>
+          <w:tcPr>
+            <w:tcW w:type="dxa" w:w="1767"/>
+            <w:tcBorders>
+              <w:top w:val="single" w:sz="8" w:space="0" w:color="404040"/>
+              <w:left w:val="single" w:sz="8" w:space="0" w:color="404040"/>
+              <w:bottom w:val="single" w:sz="8" w:space="0" w:color="404040"/>
+              <w:right w:val="single" w:sz="8" w:space="0" w:color="404040"/>
+            </w:tcBorders>
+          </w:tcPr>
+          <w:p>
+            <w:pPr>
+              <w:spacing w:before="80" w:after="80"/>
+              <w:jc w:val="center"/>
+            </w:pPr>
+            <w:r>
+              <w:rPr>
+                <w:rFonts w:ascii="Arial" w:hAnsi="Arial"/>
+                <w:b w:val="0"/>
+                <w:color w:val="30302F"/>
+                <w:sz w:val="20"/>
+              </w:rPr>
+            </w:r>
+            <w:r>
+              <w:rPr>
+                <w:rFonts w:ascii="Arial" w:hAnsi="Arial"/>
+                <w:b w:val="0"/>
+                <w:color w:val="30302F"/>
+                <w:sz w:val="20"/>
+              </w:rPr>
+              <w:t>5 500</w:t>
+            </w:r>
+          </w:p>
+        </w:tc>
+        <w:tc>
+          <w:tcPr>
+            <w:tcW w:type="dxa" w:w="1767"/>
+            <w:tcBorders>
+              <w:top w:val="single" w:sz="8" w:space="0" w:color="404040"/>
+              <w:left w:val="single" w:sz="8" w:space="0" w:color="404040"/>
+              <w:bottom w:val="single" w:sz="8" w:space="0" w:color="404040"/>
+              <w:right w:val="single" w:sz="8" w:space="0" w:color="404040"/>
+            </w:tcBorders>
+          </w:tcPr>
+          <w:p>
+            <w:pPr>
+              <w:spacing w:before="80" w:after="80"/>
+              <w:jc w:val="center"/>
+            </w:pPr>
+            <w:r>
+              <w:rPr>
+                <w:rFonts w:ascii="Arial" w:hAnsi="Arial"/>
+                <w:b w:val="0"/>
+                <w:color w:val="30302F"/>
+                <w:sz w:val="20"/>
+              </w:rPr>
+            </w:r>
+            <w:r>
+              <w:rPr>
+                <w:rFonts w:ascii="Arial" w:hAnsi="Arial"/>
+                <w:b w:val="0"/>
+                <w:color w:val="30302F"/>
+                <w:sz w:val="20"/>
+              </w:rPr>
+              <w:t>0</w:t>
+            </w:r>
+          </w:p>
+        </w:tc>
+        <w:tc>
+          <w:tcPr>
+            <w:tcW w:type="dxa" w:w="1767"/>
+            <w:tcBorders>
+              <w:top w:val="single" w:sz="8" w:space="0" w:color="404040"/>
+              <w:left w:val="single" w:sz="8" w:space="0" w:color="404040"/>
+              <w:bottom w:val="single" w:sz="8" w:space="0" w:color="404040"/>
+              <w:right w:val="single" w:sz="8" w:space="0" w:color="404040"/>
+            </w:tcBorders>
+          </w:tcPr>
+          <w:p>
+            <w:pPr>
+              <w:spacing w:before="80" w:after="80"/>
+              <w:jc w:val="center"/>
+            </w:pPr>
+            <w:r>
+              <w:rPr>
+                <w:rFonts w:ascii="Arial" w:hAnsi="Arial"/>
+                <w:b w:val="0"/>
+                <w:color w:val="30302F"/>
+                <w:sz w:val="20"/>
+              </w:rPr>
+            </w:r>
+            <w:r>
+              <w:rPr>
+                <w:rFonts w:ascii="Arial" w:hAnsi="Arial"/>
+                <w:b w:val="0"/>
+                <w:color w:val="30302F"/>
+                <w:sz w:val="20"/>
+              </w:rPr>
+              <w:t>15 500</w:t>
+            </w:r>
+          </w:p>
+        </w:tc>
+      </w:tr>
+      <w:tr>
+        <w:tc>
+          <w:tcPr>
+            <w:tcW w:type="dxa" w:w="1767"/>
+            <w:tcBorders>
+              <w:top w:val="single" w:sz="8" w:space="0" w:color="404040"/>
+              <w:left w:val="single" w:sz="8" w:space="0" w:color="404040"/>
+              <w:bottom w:val="single" w:sz="8" w:space="0" w:color="404040"/>
+              <w:right w:val="single" w:sz="8" w:space="0" w:color="404040"/>
+            </w:tcBorders>
+            <w:shd w:fill="0A5455" w:val="clear"/>
+          </w:tcPr>
+          <w:p>
+            <w:pPr>
+              <w:spacing w:before="80" w:after="80"/>
+              <w:jc w:val="left"/>
+            </w:pPr>
+            <w:r>
+              <w:rPr>
+                <w:rFonts w:ascii="Arial" w:hAnsi="Arial"/>
+                <w:b/>
+                <w:color w:val="FFFFFF"/>
+                <w:sz w:val="20"/>
+              </w:rPr>
+            </w:r>
+            <w:r>
+              <w:rPr>
+                <w:rFonts w:ascii="Arial" w:hAnsi="Arial"/>
+                <w:b/>
+                <w:color w:val="FFFFFF"/>
+                <w:sz w:val="20"/>
+              </w:rPr>
+              <w:t>Nursery habitat</w:t>
+            </w:r>
+          </w:p>
+        </w:tc>
+        <w:tc>
+          <w:tcPr>
+            <w:tcW w:type="dxa" w:w="1767"/>
+            <w:tcBorders>
+              <w:top w:val="single" w:sz="8" w:space="0" w:color="404040"/>
+              <w:left w:val="single" w:sz="8" w:space="0" w:color="404040"/>
+              <w:bottom w:val="single" w:sz="8" w:space="0" w:color="404040"/>
+              <w:right w:val="single" w:sz="8" w:space="0" w:color="404040"/>
+            </w:tcBorders>
+          </w:tcPr>
+          <w:p>
+            <w:pPr>
+              <w:spacing w:before="80" w:after="80"/>
+              <w:jc w:val="center"/>
+            </w:pPr>
+            <w:r>
+              <w:rPr>
+                <w:rFonts w:ascii="Arial" w:hAnsi="Arial"/>
+                <w:b w:val="0"/>
+                <w:color w:val="30302F"/>
+                <w:sz w:val="20"/>
+              </w:rPr>
+            </w:r>
+            <w:r>
+              <w:rPr>
+                <w:rFonts w:ascii="Arial" w:hAnsi="Arial"/>
+                <w:b w:val="0"/>
+                <w:color w:val="30302F"/>
+                <w:sz w:val="20"/>
+              </w:rPr>
+              <w:t>kg/yr</w:t>
+            </w:r>
+          </w:p>
+        </w:tc>
+        <w:tc>
+          <w:tcPr>
+            <w:tcW w:type="dxa" w:w="1767"/>
+            <w:tcBorders>
+              <w:top w:val="single" w:sz="8" w:space="0" w:color="404040"/>
+              <w:left w:val="single" w:sz="8" w:space="0" w:color="404040"/>
+              <w:bottom w:val="single" w:sz="8" w:space="0" w:color="404040"/>
+              <w:right w:val="single" w:sz="8" w:space="0" w:color="404040"/>
+            </w:tcBorders>
+          </w:tcPr>
+          <w:p>
+            <w:pPr>
+              <w:spacing w:before="80" w:after="80"/>
+              <w:jc w:val="center"/>
+            </w:pPr>
+            <w:r>
+              <w:rPr>
+                <w:rFonts w:ascii="Arial" w:hAnsi="Arial"/>
+                <w:b w:val="0"/>
+                <w:color w:val="30302F"/>
+                <w:sz w:val="20"/>
+              </w:rPr>
+            </w:r>
+            <w:r>
+              <w:rPr>
+                <w:rFonts w:ascii="Arial" w:hAnsi="Arial"/>
+                <w:b w:val="0"/>
+                <w:color w:val="30302F"/>
+                <w:sz w:val="20"/>
+              </w:rPr>
+              <w:t>7 300</w:t>
+            </w:r>
+          </w:p>
+        </w:tc>
+        <w:tc>
+          <w:tcPr>
+            <w:tcW w:type="dxa" w:w="1767"/>
+            <w:tcBorders>
+              <w:top w:val="single" w:sz="8" w:space="0" w:color="404040"/>
+              <w:left w:val="single" w:sz="8" w:space="0" w:color="404040"/>
+              <w:bottom w:val="single" w:sz="8" w:space="0" w:color="404040"/>
+              <w:right w:val="single" w:sz="8" w:space="0" w:color="404040"/>
+            </w:tcBorders>
+          </w:tcPr>
+          <w:p>
+            <w:pPr>
+              <w:spacing w:before="80" w:after="80"/>
+              <w:jc w:val="center"/>
+            </w:pPr>
+            <w:r>
+              <w:rPr>
+                <w:rFonts w:ascii="Arial" w:hAnsi="Arial"/>
+                <w:b w:val="0"/>
+                <w:color w:val="30302F"/>
+                <w:sz w:val="20"/>
+              </w:rPr>
+            </w:r>
+            <w:r>
+              <w:rPr>
+                <w:rFonts w:ascii="Arial" w:hAnsi="Arial"/>
+                <w:b w:val="0"/>
+                <w:color w:val="30302F"/>
+                <w:sz w:val="20"/>
+              </w:rPr>
+              <w:t>0</w:t>
+            </w:r>
+          </w:p>
+        </w:tc>
+        <w:tc>
+          <w:tcPr>
+            <w:tcW w:type="dxa" w:w="1767"/>
+            <w:tcBorders>
+              <w:top w:val="single" w:sz="8" w:space="0" w:color="404040"/>
+              <w:left w:val="single" w:sz="8" w:space="0" w:color="404040"/>
+              <w:bottom w:val="single" w:sz="8" w:space="0" w:color="404040"/>
+              <w:right w:val="single" w:sz="8" w:space="0" w:color="404040"/>
+            </w:tcBorders>
+          </w:tcPr>
+          <w:p>
+            <w:pPr>
+              <w:spacing w:before="80" w:after="80"/>
+              <w:jc w:val="center"/>
+            </w:pPr>
+            <w:r>
+              <w:rPr>
+                <w:rFonts w:ascii="Arial" w:hAnsi="Arial"/>
+                <w:b w:val="0"/>
+                <w:color w:val="30302F"/>
+                <w:sz w:val="20"/>
+              </w:rPr>
+            </w:r>
+            <w:r>
+              <w:rPr>
+                <w:rFonts w:ascii="Arial" w:hAnsi="Arial"/>
+                <w:b w:val="0"/>
+                <w:color w:val="30302F"/>
+                <w:sz w:val="20"/>
+              </w:rPr>
+              <w:t>0</w:t>
+            </w:r>
+          </w:p>
+        </w:tc>
+        <w:tc>
+          <w:tcPr>
+            <w:tcW w:type="dxa" w:w="1767"/>
+            <w:tcBorders>
+              <w:top w:val="single" w:sz="8" w:space="0" w:color="404040"/>
+              <w:left w:val="single" w:sz="8" w:space="0" w:color="404040"/>
+              <w:bottom w:val="single" w:sz="8" w:space="0" w:color="404040"/>
+              <w:right w:val="single" w:sz="8" w:space="0" w:color="404040"/>
+            </w:tcBorders>
+          </w:tcPr>
+          <w:p>
+            <w:pPr>
+              <w:spacing w:before="80" w:after="80"/>
+              <w:jc w:val="center"/>
+            </w:pPr>
+            <w:r>
+              <w:rPr>
+                <w:rFonts w:ascii="Arial" w:hAnsi="Arial"/>
+                <w:b w:val="0"/>
+                <w:color w:val="30302F"/>
+                <w:sz w:val="20"/>
+              </w:rPr>
+            </w:r>
+            <w:r>
+              <w:rPr>
+                <w:rFonts w:ascii="Arial" w:hAnsi="Arial"/>
+                <w:b w:val="0"/>
+                <w:color w:val="30302F"/>
+                <w:sz w:val="20"/>
+              </w:rPr>
+              <w:t>0</w:t>
+            </w:r>
+          </w:p>
+        </w:tc>
+        <w:tc>
+          <w:tcPr>
+            <w:tcW w:type="dxa" w:w="1767"/>
+            <w:tcBorders>
+              <w:top w:val="single" w:sz="8" w:space="0" w:color="404040"/>
+              <w:left w:val="single" w:sz="8" w:space="0" w:color="404040"/>
+              <w:bottom w:val="single" w:sz="8" w:space="0" w:color="404040"/>
+              <w:right w:val="single" w:sz="8" w:space="0" w:color="404040"/>
+            </w:tcBorders>
+          </w:tcPr>
+          <w:p>
+            <w:pPr>
+              <w:spacing w:before="80" w:after="80"/>
+              <w:jc w:val="center"/>
+            </w:pPr>
+            <w:r>
+              <w:rPr>
+                <w:rFonts w:ascii="Arial" w:hAnsi="Arial"/>
+                <w:b w:val="0"/>
+                <w:color w:val="30302F"/>
+                <w:sz w:val="20"/>
+              </w:rPr>
+            </w:r>
+            <w:r>
+              <w:rPr>
+                <w:rFonts w:ascii="Arial" w:hAnsi="Arial"/>
+                <w:b w:val="0"/>
+                <w:color w:val="30302F"/>
+                <w:sz w:val="20"/>
+              </w:rPr>
+              <w:t>0</w:t>
+            </w:r>
+          </w:p>
+        </w:tc>
+        <w:tc>
+          <w:tcPr>
+            <w:tcW w:type="dxa" w:w="1767"/>
+            <w:tcBorders>
+              <w:top w:val="single" w:sz="8" w:space="0" w:color="404040"/>
+              <w:left w:val="single" w:sz="8" w:space="0" w:color="404040"/>
+              <w:bottom w:val="single" w:sz="8" w:space="0" w:color="404040"/>
+              <w:right w:val="single" w:sz="8" w:space="0" w:color="404040"/>
+            </w:tcBorders>
+          </w:tcPr>
+          <w:p>
+            <w:pPr>
+              <w:spacing w:before="80" w:after="80"/>
+              <w:jc w:val="center"/>
+            </w:pPr>
+            <w:r>
+              <w:rPr>
+                <w:rFonts w:ascii="Arial" w:hAnsi="Arial"/>
+                <w:b w:val="0"/>
+                <w:color w:val="30302F"/>
+                <w:sz w:val="20"/>
+              </w:rPr>
+            </w:r>
+            <w:r>
+              <w:rPr>
+                <w:rFonts w:ascii="Arial" w:hAnsi="Arial"/>
+                <w:b w:val="0"/>
+                <w:color w:val="30302F"/>
+                <w:sz w:val="20"/>
+              </w:rPr>
+              <w:t>7 300</w:t>
+            </w:r>
+          </w:p>
+        </w:tc>
+      </w:tr>
+      <w:tr>
+        <w:tc>
+          <w:tcPr>
+            <w:tcW w:type="dxa" w:w="1767"/>
+            <w:tcBorders>
+              <w:top w:val="single" w:sz="8" w:space="0" w:color="404040"/>
+              <w:left w:val="single" w:sz="8" w:space="0" w:color="404040"/>
+              <w:bottom w:val="single" w:sz="8" w:space="0" w:color="404040"/>
+              <w:right w:val="single" w:sz="8" w:space="0" w:color="404040"/>
+            </w:tcBorders>
+            <w:shd w:fill="0A5455" w:val="clear"/>
+          </w:tcPr>
+          <w:p>
+            <w:pPr>
+              <w:spacing w:before="80" w:after="80"/>
+              <w:jc w:val="left"/>
+            </w:pPr>
+            <w:r>
+              <w:rPr>
+                <w:rFonts w:ascii="Arial" w:hAnsi="Arial"/>
+                <w:b/>
+                <w:color w:val="FFFFFF"/>
+                <w:sz w:val="20"/>
+              </w:rPr>
+            </w:r>
+            <w:r>
+              <w:rPr>
+                <w:rFonts w:ascii="Arial" w:hAnsi="Arial"/>
+                <w:b/>
+                <w:color w:val="FFFFFF"/>
+                <w:sz w:val="20"/>
+              </w:rPr>
+              <w:t>Recreation</w:t>
+            </w:r>
+          </w:p>
+        </w:tc>
+        <w:tc>
+          <w:tcPr>
+            <w:tcW w:type="dxa" w:w="1767"/>
+            <w:tcBorders>
+              <w:top w:val="single" w:sz="8" w:space="0" w:color="404040"/>
+              <w:left w:val="single" w:sz="8" w:space="0" w:color="404040"/>
+              <w:bottom w:val="single" w:sz="8" w:space="0" w:color="404040"/>
+              <w:right w:val="single" w:sz="8" w:space="0" w:color="404040"/>
+            </w:tcBorders>
+          </w:tcPr>
+          <w:p>
+            <w:pPr>
+              <w:spacing w:before="80" w:after="80"/>
+              <w:jc w:val="center"/>
+            </w:pPr>
+            <w:r>
+              <w:rPr>
+                <w:rFonts w:ascii="Arial" w:hAnsi="Arial"/>
+                <w:b w:val="0"/>
+                <w:color w:val="30302F"/>
+                <w:sz w:val="20"/>
+              </w:rPr>
+            </w:r>
+            <w:r>
+              <w:rPr>
+                <w:rFonts w:ascii="Arial" w:hAnsi="Arial"/>
+                <w:b w:val="0"/>
+                <w:color w:val="30302F"/>
+                <w:sz w:val="20"/>
+              </w:rPr>
+              <w:t>visitors/yr</w:t>
+            </w:r>
+          </w:p>
+        </w:tc>
+        <w:tc>
+          <w:tcPr>
+            <w:tcW w:type="dxa" w:w="1767"/>
+            <w:tcBorders>
+              <w:top w:val="single" w:sz="8" w:space="0" w:color="404040"/>
+              <w:left w:val="single" w:sz="8" w:space="0" w:color="404040"/>
+              <w:bottom w:val="single" w:sz="8" w:space="0" w:color="404040"/>
+              <w:right w:val="single" w:sz="8" w:space="0" w:color="404040"/>
+            </w:tcBorders>
+          </w:tcPr>
+          <w:p>
+            <w:pPr>
+              <w:spacing w:before="80" w:after="80"/>
+              <w:jc w:val="center"/>
+            </w:pPr>
+            <w:r>
+              <w:rPr>
+                <w:rFonts w:ascii="Arial" w:hAnsi="Arial"/>
+                <w:b w:val="0"/>
+                <w:color w:val="30302F"/>
+                <w:sz w:val="20"/>
+              </w:rPr>
+            </w:r>
+            <w:r>
+              <w:rPr>
+                <w:rFonts w:ascii="Arial" w:hAnsi="Arial"/>
+                <w:b w:val="0"/>
+                <w:color w:val="30302F"/>
+                <w:sz w:val="20"/>
+              </w:rPr>
+              <w:t>0</w:t>
+            </w:r>
+          </w:p>
+        </w:tc>
+        <w:tc>
+          <w:tcPr>
+            <w:tcW w:type="dxa" w:w="1767"/>
+            <w:tcBorders>
+              <w:top w:val="single" w:sz="8" w:space="0" w:color="404040"/>
+              <w:left w:val="single" w:sz="8" w:space="0" w:color="404040"/>
+              <w:bottom w:val="single" w:sz="8" w:space="0" w:color="404040"/>
+              <w:right w:val="single" w:sz="8" w:space="0" w:color="404040"/>
+            </w:tcBorders>
+          </w:tcPr>
+          <w:p>
+            <w:pPr>
+              <w:spacing w:before="80" w:after="80"/>
+              <w:jc w:val="center"/>
+            </w:pPr>
+            <w:r>
+              <w:rPr>
+                <w:rFonts w:ascii="Arial" w:hAnsi="Arial"/>
+                <w:b w:val="0"/>
+                <w:color w:val="30302F"/>
+                <w:sz w:val="20"/>
+              </w:rPr>
+            </w:r>
+            <w:r>
+              <w:rPr>
+                <w:rFonts w:ascii="Arial" w:hAnsi="Arial"/>
+                <w:b w:val="0"/>
+                <w:color w:val="30302F"/>
+                <w:sz w:val="20"/>
+              </w:rPr>
+              <w:t>15 000</w:t>
+            </w:r>
+          </w:p>
+        </w:tc>
+        <w:tc>
+          <w:tcPr>
+            <w:tcW w:type="dxa" w:w="1767"/>
+            <w:tcBorders>
+              <w:top w:val="single" w:sz="8" w:space="0" w:color="404040"/>
+              <w:left w:val="single" w:sz="8" w:space="0" w:color="404040"/>
+              <w:bottom w:val="single" w:sz="8" w:space="0" w:color="404040"/>
+              <w:right w:val="single" w:sz="8" w:space="0" w:color="404040"/>
+            </w:tcBorders>
+          </w:tcPr>
+          <w:p>
+            <w:pPr>
+              <w:spacing w:before="80" w:after="80"/>
+              <w:jc w:val="center"/>
+            </w:pPr>
+            <w:r>
+              <w:rPr>
+                <w:rFonts w:ascii="Arial" w:hAnsi="Arial"/>
+                <w:b w:val="0"/>
+                <w:color w:val="30302F"/>
+                <w:sz w:val="20"/>
+              </w:rPr>
+            </w:r>
+            <w:r>
+              <w:rPr>
+                <w:rFonts w:ascii="Arial" w:hAnsi="Arial"/>
+                <w:b w:val="0"/>
+                <w:color w:val="30302F"/>
+                <w:sz w:val="20"/>
+              </w:rPr>
+              <w:t>2 400</w:t>
+            </w:r>
+          </w:p>
+        </w:tc>
+        <w:tc>
+          <w:tcPr>
+            <w:tcW w:type="dxa" w:w="1767"/>
+            <w:tcBorders>
+              <w:top w:val="single" w:sz="8" w:space="0" w:color="404040"/>
+              <w:left w:val="single" w:sz="8" w:space="0" w:color="404040"/>
+              <w:bottom w:val="single" w:sz="8" w:space="0" w:color="404040"/>
+              <w:right w:val="single" w:sz="8" w:space="0" w:color="404040"/>
+            </w:tcBorders>
+          </w:tcPr>
+          <w:p>
+            <w:pPr>
+              <w:spacing w:before="80" w:after="80"/>
+              <w:jc w:val="center"/>
+            </w:pPr>
+            <w:r>
+              <w:rPr>
+                <w:rFonts w:ascii="Arial" w:hAnsi="Arial"/>
+                <w:b w:val="0"/>
+                <w:color w:val="30302F"/>
+                <w:sz w:val="20"/>
+              </w:rPr>
+            </w:r>
+            <w:r>
+              <w:rPr>
+                <w:rFonts w:ascii="Arial" w:hAnsi="Arial"/>
+                <w:b w:val="0"/>
+                <w:color w:val="30302F"/>
+                <w:sz w:val="20"/>
+              </w:rPr>
+              <w:t>0</w:t>
+            </w:r>
+          </w:p>
+        </w:tc>
+        <w:tc>
+          <w:tcPr>
+            <w:tcW w:type="dxa" w:w="1767"/>
+            <w:tcBorders>
+              <w:top w:val="single" w:sz="8" w:space="0" w:color="404040"/>
+              <w:left w:val="single" w:sz="8" w:space="0" w:color="404040"/>
+              <w:bottom w:val="single" w:sz="8" w:space="0" w:color="404040"/>
+              <w:right w:val="single" w:sz="8" w:space="0" w:color="404040"/>
+            </w:tcBorders>
+          </w:tcPr>
+          <w:p>
+            <w:pPr>
+              <w:spacing w:before="80" w:after="80"/>
+              <w:jc w:val="center"/>
+            </w:pPr>
+            <w:r>
+              <w:rPr>
+                <w:rFonts w:ascii="Arial" w:hAnsi="Arial"/>
+                <w:b w:val="0"/>
+                <w:color w:val="30302F"/>
+                <w:sz w:val="20"/>
+              </w:rPr>
+            </w:r>
+            <w:r>
+              <w:rPr>
+                <w:rFonts w:ascii="Arial" w:hAnsi="Arial"/>
+                <w:b w:val="0"/>
+                <w:color w:val="30302F"/>
+                <w:sz w:val="20"/>
+              </w:rPr>
+              <w:t>0</w:t>
+            </w:r>
+          </w:p>
+        </w:tc>
+        <w:tc>
+          <w:tcPr>
+            <w:tcW w:type="dxa" w:w="1767"/>
+            <w:tcBorders>
+              <w:top w:val="single" w:sz="8" w:space="0" w:color="404040"/>
+              <w:left w:val="single" w:sz="8" w:space="0" w:color="404040"/>
+              <w:bottom w:val="single" w:sz="8" w:space="0" w:color="404040"/>
+              <w:right w:val="single" w:sz="8" w:space="0" w:color="404040"/>
+            </w:tcBorders>
+          </w:tcPr>
+          <w:p>
+            <w:pPr>
+              <w:spacing w:before="80" w:after="80"/>
+              <w:jc w:val="center"/>
+            </w:pPr>
+            <w:r>
+              <w:rPr>
+                <w:rFonts w:ascii="Arial" w:hAnsi="Arial"/>
+                <w:b w:val="0"/>
+                <w:color w:val="30302F"/>
+                <w:sz w:val="20"/>
+              </w:rPr>
+            </w:r>
+            <w:r>
+              <w:rPr>
+                <w:rFonts w:ascii="Arial" w:hAnsi="Arial"/>
+                <w:b w:val="0"/>
+                <w:color w:val="30302F"/>
+                <w:sz w:val="20"/>
+              </w:rPr>
+              <w:t>17 400</w:t>
+            </w:r>
+          </w:p>
+        </w:tc>
+      </w:tr>
+      <w:tr>
+        <w:tc>
+          <w:tcPr>
+            <w:tcW w:type="dxa" w:w="1767"/>
+            <w:tcBorders>
+              <w:top w:val="single" w:sz="8" w:space="0" w:color="404040"/>
+              <w:left w:val="single" w:sz="8" w:space="0" w:color="404040"/>
+              <w:bottom w:val="single" w:sz="8" w:space="0" w:color="404040"/>
+              <w:right w:val="single" w:sz="8" w:space="0" w:color="404040"/>
+            </w:tcBorders>
+            <w:shd w:fill="0A5455" w:val="clear"/>
+          </w:tcPr>
+          <w:p>
+            <w:pPr>
+              <w:spacing w:before="80" w:after="80"/>
+              <w:jc w:val="left"/>
+            </w:pPr>
+            <w:r>
+              <w:rPr>
+                <w:rFonts w:ascii="Arial" w:hAnsi="Arial"/>
+                <w:b/>
+                <w:color w:val="FFFFFF"/>
+                <w:sz w:val="20"/>
+              </w:rPr>
+            </w:r>
+            <w:r>
+              <w:rPr>
+                <w:rFonts w:ascii="Arial" w:hAnsi="Arial"/>
+                <w:b/>
+                <w:color w:val="FFFFFF"/>
+                <w:sz w:val="20"/>
+              </w:rPr>
+              <w:t>Gleaning</w:t>
+            </w:r>
+          </w:p>
+        </w:tc>
+        <w:tc>
+          <w:tcPr>
+            <w:tcW w:type="dxa" w:w="1767"/>
+            <w:tcBorders>
+              <w:top w:val="single" w:sz="8" w:space="0" w:color="404040"/>
+              <w:left w:val="single" w:sz="8" w:space="0" w:color="404040"/>
+              <w:bottom w:val="single" w:sz="8" w:space="0" w:color="404040"/>
+              <w:right w:val="single" w:sz="8" w:space="0" w:color="404040"/>
+            </w:tcBorders>
+          </w:tcPr>
+          <w:p>
+            <w:pPr>
+              <w:spacing w:before="80" w:after="80"/>
+              <w:jc w:val="center"/>
+            </w:pPr>
+            <w:r>
+              <w:rPr>
+                <w:rFonts w:ascii="Arial" w:hAnsi="Arial"/>
+                <w:b w:val="0"/>
+                <w:color w:val="30302F"/>
+                <w:sz w:val="20"/>
+              </w:rPr>
+            </w:r>
+            <w:r>
+              <w:rPr>
+                <w:rFonts w:ascii="Arial" w:hAnsi="Arial"/>
+                <w:b w:val="0"/>
+                <w:color w:val="30302F"/>
+                <w:sz w:val="20"/>
+              </w:rPr>
+              <w:t>hours/yr</w:t>
+            </w:r>
+          </w:p>
+        </w:tc>
+        <w:tc>
+          <w:tcPr>
+            <w:tcW w:type="dxa" w:w="1767"/>
+            <w:tcBorders>
+              <w:top w:val="single" w:sz="8" w:space="0" w:color="404040"/>
+              <w:left w:val="single" w:sz="8" w:space="0" w:color="404040"/>
+              <w:bottom w:val="single" w:sz="8" w:space="0" w:color="404040"/>
+              <w:right w:val="single" w:sz="8" w:space="0" w:color="404040"/>
+            </w:tcBorders>
+          </w:tcPr>
+          <w:p>
+            <w:pPr>
+              <w:spacing w:before="80" w:after="80"/>
+              <w:jc w:val="center"/>
+            </w:pPr>
+            <w:r>
+              <w:rPr>
+                <w:rFonts w:ascii="Arial" w:hAnsi="Arial"/>
+                <w:b w:val="0"/>
+                <w:color w:val="30302F"/>
+                <w:sz w:val="20"/>
+              </w:rPr>
+            </w:r>
+            <w:r>
+              <w:rPr>
+                <w:rFonts w:ascii="Arial" w:hAnsi="Arial"/>
+                <w:b w:val="0"/>
+                <w:color w:val="30302F"/>
+                <w:sz w:val="20"/>
+              </w:rPr>
+              <w:t>0</w:t>
+            </w:r>
+          </w:p>
+        </w:tc>
+        <w:tc>
+          <w:tcPr>
+            <w:tcW w:type="dxa" w:w="1767"/>
+            <w:tcBorders>
+              <w:top w:val="single" w:sz="8" w:space="0" w:color="404040"/>
+              <w:left w:val="single" w:sz="8" w:space="0" w:color="404040"/>
+              <w:bottom w:val="single" w:sz="8" w:space="0" w:color="404040"/>
+              <w:right w:val="single" w:sz="8" w:space="0" w:color="404040"/>
+            </w:tcBorders>
+          </w:tcPr>
+          <w:p>
+            <w:pPr>
+              <w:spacing w:before="80" w:after="80"/>
+              <w:jc w:val="center"/>
+            </w:pPr>
+            <w:r>
+              <w:rPr>
+                <w:rFonts w:ascii="Arial" w:hAnsi="Arial"/>
+                <w:b w:val="0"/>
+                <w:color w:val="30302F"/>
+                <w:sz w:val="20"/>
+              </w:rPr>
+            </w:r>
+            <w:r>
+              <w:rPr>
+                <w:rFonts w:ascii="Arial" w:hAnsi="Arial"/>
+                <w:b w:val="0"/>
+                <w:color w:val="30302F"/>
+                <w:sz w:val="20"/>
+              </w:rPr>
+              <w:t>0</w:t>
+            </w:r>
+          </w:p>
+        </w:tc>
+        <w:tc>
+          <w:tcPr>
+            <w:tcW w:type="dxa" w:w="1767"/>
+            <w:tcBorders>
+              <w:top w:val="single" w:sz="8" w:space="0" w:color="404040"/>
+              <w:left w:val="single" w:sz="8" w:space="0" w:color="404040"/>
+              <w:bottom w:val="single" w:sz="8" w:space="0" w:color="404040"/>
+              <w:right w:val="single" w:sz="8" w:space="0" w:color="404040"/>
+            </w:tcBorders>
+          </w:tcPr>
+          <w:p>
+            <w:pPr>
+              <w:spacing w:before="80" w:after="80"/>
+              <w:jc w:val="center"/>
+            </w:pPr>
+            <w:r>
+              <w:rPr>
+                <w:rFonts w:ascii="Arial" w:hAnsi="Arial"/>
+                <w:b w:val="0"/>
+                <w:color w:val="30302F"/>
+                <w:sz w:val="20"/>
+              </w:rPr>
+            </w:r>
+            <w:r>
+              <w:rPr>
+                <w:rFonts w:ascii="Arial" w:hAnsi="Arial"/>
+                <w:b w:val="0"/>
+                <w:color w:val="30302F"/>
+                <w:sz w:val="20"/>
+              </w:rPr>
+              <w:t>18 000</w:t>
+            </w:r>
+          </w:p>
+        </w:tc>
+        <w:tc>
+          <w:tcPr>
+            <w:tcW w:type="dxa" w:w="1767"/>
+            <w:tcBorders>
+              <w:top w:val="single" w:sz="8" w:space="0" w:color="404040"/>
+              <w:left w:val="single" w:sz="8" w:space="0" w:color="404040"/>
+              <w:bottom w:val="single" w:sz="8" w:space="0" w:color="404040"/>
+              <w:right w:val="single" w:sz="8" w:space="0" w:color="404040"/>
+            </w:tcBorders>
+          </w:tcPr>
+          <w:p>
+            <w:pPr>
+              <w:spacing w:before="80" w:after="80"/>
+              <w:jc w:val="center"/>
+            </w:pPr>
+            <w:r>
+              <w:rPr>
+                <w:rFonts w:ascii="Arial" w:hAnsi="Arial"/>
+                <w:b w:val="0"/>
+                <w:color w:val="30302F"/>
+                <w:sz w:val="20"/>
+              </w:rPr>
+            </w:r>
+            <w:r>
+              <w:rPr>
+                <w:rFonts w:ascii="Arial" w:hAnsi="Arial"/>
+                <w:b w:val="0"/>
+                <w:color w:val="30302F"/>
+                <w:sz w:val="20"/>
+              </w:rPr>
+              <w:t>0</w:t>
+            </w:r>
+          </w:p>
+        </w:tc>
+        <w:tc>
+          <w:tcPr>
+            <w:tcW w:type="dxa" w:w="1767"/>
+            <w:tcBorders>
+              <w:top w:val="single" w:sz="8" w:space="0" w:color="404040"/>
+              <w:left w:val="single" w:sz="8" w:space="0" w:color="404040"/>
+              <w:bottom w:val="single" w:sz="8" w:space="0" w:color="404040"/>
+              <w:right w:val="single" w:sz="8" w:space="0" w:color="404040"/>
+            </w:tcBorders>
+          </w:tcPr>
+          <w:p>
+            <w:pPr>
+              <w:spacing w:before="80" w:after="80"/>
+              <w:jc w:val="center"/>
+            </w:pPr>
+            <w:r>
+              <w:rPr>
+                <w:rFonts w:ascii="Arial" w:hAnsi="Arial"/>
+                <w:b w:val="0"/>
+                <w:color w:val="30302F"/>
+                <w:sz w:val="20"/>
+              </w:rPr>
+            </w:r>
+            <w:r>
+              <w:rPr>
+                <w:rFonts w:ascii="Arial" w:hAnsi="Arial"/>
+                <w:b w:val="0"/>
+                <w:color w:val="30302F"/>
+                <w:sz w:val="20"/>
+              </w:rPr>
+              <w:t>0</w:t>
+            </w:r>
+          </w:p>
+        </w:tc>
+        <w:tc>
+          <w:tcPr>
+            <w:tcW w:type="dxa" w:w="1767"/>
+            <w:tcBorders>
+              <w:top w:val="single" w:sz="8" w:space="0" w:color="404040"/>
+              <w:left w:val="single" w:sz="8" w:space="0" w:color="404040"/>
+              <w:bottom w:val="single" w:sz="8" w:space="0" w:color="404040"/>
+              <w:right w:val="single" w:sz="8" w:space="0" w:color="404040"/>
+            </w:tcBorders>
+          </w:tcPr>
+          <w:p>
+            <w:pPr>
+              <w:spacing w:before="80" w:after="80"/>
+              <w:jc w:val="center"/>
+            </w:pPr>
+            <w:r>
+              <w:rPr>
+                <w:rFonts w:ascii="Arial" w:hAnsi="Arial"/>
+                <w:b w:val="0"/>
+                <w:color w:val="30302F"/>
+                <w:sz w:val="20"/>
+              </w:rPr>
+            </w:r>
+            <w:r>
+              <w:rPr>
+                <w:rFonts w:ascii="Arial" w:hAnsi="Arial"/>
+                <w:b w:val="0"/>
+                <w:color w:val="30302F"/>
+                <w:sz w:val="20"/>
+              </w:rPr>
+              <w:t>18 000</w:t>
+            </w:r>
+          </w:p>
+        </w:tc>
+      </w:tr>
+    </w:tbl>
+    <w:p>
+      <w:pPr>
+        <w:spacing w:before="80" w:after="80"/>
+        <w:jc w:val="left"/>
+      </w:pPr>
+      <w:r>
+        <w:rPr>
+          <w:i/>
+        </w:rPr>
+        <w:t>Supply is organized by ecosystem. Use is organized by beneficiary. Same quantities, different perspective.</w:t>
+      </w:r>
+    </w:p>
+    <w:p>
+      <w:pPr>
+        <w:spacing w:before="360" w:after="120"/>
+      </w:pPr>
+      <w:r>
+        <w:rPr>
+          <w:rFonts w:ascii="Arial" w:hAnsi="Arial"/>
+          <w:b/>
+          <w:color w:val="0A5455"/>
+          <w:sz w:val="26"/>
+        </w:rPr>
+        <w:t>Table 4d -- Ecosystem Service Monetary Use (Part B): USD/yr by Beneficiary</w:t>
+      </w:r>
+    </w:p>
+    <w:tbl>
+      <w:tblPr>
+        <w:tblW w:type="auto" w:w="0"/>
+        <w:jc w:val="center"/>
+        <w:tblLook w:firstColumn="1" w:firstRow="1" w:lastColumn="0" w:lastRow="0" w:noHBand="0" w:noVBand="1" w:val="04A0"/>
+      </w:tblPr>
+      <w:tblGrid>
+        <w:gridCol w:w="1767"/>
+        <w:gridCol w:w="1767"/>
+        <w:gridCol w:w="1767"/>
+        <w:gridCol w:w="1767"/>
+        <w:gridCol w:w="1767"/>
+        <w:gridCol w:w="1767"/>
+        <w:gridCol w:w="1767"/>
+        <w:gridCol w:w="1767"/>
+      </w:tblGrid>
+      <w:tr>
+        <w:tc>
+          <w:tcPr>
+            <w:tcW w:type="dxa" w:w="1767"/>
+            <w:tcBorders>
+              <w:top w:val="single" w:sz="8" w:space="0" w:color="404040"/>
+              <w:left w:val="single" w:sz="8" w:space="0" w:color="404040"/>
+              <w:bottom w:val="single" w:sz="8" w:space="0" w:color="404040"/>
+              <w:right w:val="single" w:sz="8" w:space="0" w:color="404040"/>
+            </w:tcBorders>
+            <w:shd w:fill="3B9C7B" w:val="clear"/>
+          </w:tcPr>
+          <w:p>
+            <w:pPr>
+              <w:spacing w:before="80" w:after="80"/>
+              <w:jc w:val="center"/>
+            </w:pPr>
+            <w:r>
+              <w:rPr>
+                <w:rFonts w:ascii="Arial" w:hAnsi="Arial"/>
+                <w:b/>
+                <w:color w:val="FFFFFF"/>
+                <w:sz w:val="20"/>
+              </w:rPr>
+            </w:r>
+            <w:r>
+              <w:rPr>
+                <w:rFonts w:ascii="Arial" w:hAnsi="Arial"/>
+                <w:b/>
+                <w:color w:val="FFFFFF"/>
+                <w:sz w:val="20"/>
+              </w:rPr>
+              <w:t>Service</w:t>
+            </w:r>
+          </w:p>
+        </w:tc>
+        <w:tc>
+          <w:tcPr>
+            <w:tcW w:type="dxa" w:w="1767"/>
+            <w:tcBorders>
+              <w:top w:val="single" w:sz="8" w:space="0" w:color="404040"/>
+              <w:left w:val="single" w:sz="8" w:space="0" w:color="404040"/>
+              <w:bottom w:val="single" w:sz="8" w:space="0" w:color="404040"/>
+              <w:right w:val="single" w:sz="8" w:space="0" w:color="404040"/>
+            </w:tcBorders>
+            <w:shd w:fill="3B9C7B" w:val="clear"/>
+          </w:tcPr>
+          <w:p>
+            <w:pPr>
+              <w:spacing w:before="80" w:after="80"/>
+              <w:jc w:val="center"/>
+            </w:pPr>
+            <w:r>
+              <w:rPr>
+                <w:rFonts w:ascii="Arial" w:hAnsi="Arial"/>
+                <w:b/>
+                <w:color w:val="FFFFFF"/>
+                <w:sz w:val="20"/>
+              </w:rPr>
+            </w:r>
+            <w:r>
+              <w:rPr>
+                <w:rFonts w:ascii="Arial" w:hAnsi="Arial"/>
+                <w:b/>
+                <w:color w:val="FFFFFF"/>
+                <w:sz w:val="20"/>
+              </w:rPr>
+              <w:t>Method</w:t>
+            </w:r>
+          </w:p>
+        </w:tc>
+        <w:tc>
+          <w:tcPr>
+            <w:tcW w:type="dxa" w:w="1767"/>
+            <w:tcBorders>
+              <w:top w:val="single" w:sz="8" w:space="0" w:color="404040"/>
+              <w:left w:val="single" w:sz="8" w:space="0" w:color="404040"/>
+              <w:bottom w:val="single" w:sz="8" w:space="0" w:color="404040"/>
+              <w:right w:val="single" w:sz="8" w:space="0" w:color="404040"/>
+            </w:tcBorders>
+            <w:shd w:fill="3B9C7B" w:val="clear"/>
+          </w:tcPr>
+          <w:p>
+            <w:pPr>
+              <w:spacing w:before="80" w:after="80"/>
+              <w:jc w:val="center"/>
+            </w:pPr>
+            <w:r>
+              <w:rPr>
+                <w:rFonts w:ascii="Arial" w:hAnsi="Arial"/>
+                <w:b/>
+                <w:color w:val="FFFFFF"/>
+                <w:sz w:val="20"/>
+              </w:rPr>
+            </w:r>
+            <w:r>
+              <w:rPr>
+                <w:rFonts w:ascii="Arial" w:hAnsi="Arial"/>
+                <w:b/>
+                <w:color w:val="FFFFFF"/>
+                <w:sz w:val="20"/>
+              </w:rPr>
+              <w:t>Fisheries</w:t>
+            </w:r>
+          </w:p>
+        </w:tc>
+        <w:tc>
+          <w:tcPr>
+            <w:tcW w:type="dxa" w:w="1767"/>
+            <w:tcBorders>
+              <w:top w:val="single" w:sz="8" w:space="0" w:color="404040"/>
+              <w:left w:val="single" w:sz="8" w:space="0" w:color="404040"/>
+              <w:bottom w:val="single" w:sz="8" w:space="0" w:color="404040"/>
+              <w:right w:val="single" w:sz="8" w:space="0" w:color="404040"/>
+            </w:tcBorders>
+            <w:shd w:fill="3B9C7B" w:val="clear"/>
+          </w:tcPr>
+          <w:p>
+            <w:pPr>
+              <w:spacing w:before="80" w:after="80"/>
+              <w:jc w:val="center"/>
+            </w:pPr>
+            <w:r>
+              <w:rPr>
+                <w:rFonts w:ascii="Arial" w:hAnsi="Arial"/>
+                <w:b/>
+                <w:color w:val="FFFFFF"/>
+                <w:sz w:val="20"/>
+              </w:rPr>
+            </w:r>
+            <w:r>
+              <w:rPr>
+                <w:rFonts w:ascii="Arial" w:hAnsi="Arial"/>
+                <w:b/>
+                <w:color w:val="FFFFFF"/>
+                <w:sz w:val="20"/>
+              </w:rPr>
+              <w:t>Tourism</w:t>
+            </w:r>
+          </w:p>
+        </w:tc>
+        <w:tc>
+          <w:tcPr>
+            <w:tcW w:type="dxa" w:w="1767"/>
+            <w:tcBorders>
+              <w:top w:val="single" w:sz="8" w:space="0" w:color="404040"/>
+              <w:left w:val="single" w:sz="8" w:space="0" w:color="404040"/>
+              <w:bottom w:val="single" w:sz="8" w:space="0" w:color="404040"/>
+              <w:right w:val="single" w:sz="8" w:space="0" w:color="404040"/>
+            </w:tcBorders>
+            <w:shd w:fill="3B9C7B" w:val="clear"/>
+          </w:tcPr>
+          <w:p>
+            <w:pPr>
+              <w:spacing w:before="80" w:after="80"/>
+              <w:jc w:val="center"/>
+            </w:pPr>
+            <w:r>
+              <w:rPr>
+                <w:rFonts w:ascii="Arial" w:hAnsi="Arial"/>
+                <w:b/>
+                <w:color w:val="FFFFFF"/>
+                <w:sz w:val="20"/>
+              </w:rPr>
+            </w:r>
+            <w:r>
+              <w:rPr>
+                <w:rFonts w:ascii="Arial" w:hAnsi="Arial"/>
+                <w:b/>
+                <w:color w:val="FFFFFF"/>
+                <w:sz w:val="20"/>
+              </w:rPr>
+              <w:t>Coastal HH</w:t>
+            </w:r>
+          </w:p>
+        </w:tc>
+        <w:tc>
+          <w:tcPr>
+            <w:tcW w:type="dxa" w:w="1767"/>
+            <w:tcBorders>
+              <w:top w:val="single" w:sz="8" w:space="0" w:color="404040"/>
+              <w:left w:val="single" w:sz="8" w:space="0" w:color="404040"/>
+              <w:bottom w:val="single" w:sz="8" w:space="0" w:color="404040"/>
+              <w:right w:val="single" w:sz="8" w:space="0" w:color="404040"/>
+            </w:tcBorders>
+            <w:shd w:fill="3B9C7B" w:val="clear"/>
+          </w:tcPr>
+          <w:p>
+            <w:pPr>
+              <w:spacing w:before="80" w:after="80"/>
+              <w:jc w:val="center"/>
+            </w:pPr>
+            <w:r>
+              <w:rPr>
+                <w:rFonts w:ascii="Arial" w:hAnsi="Arial"/>
+                <w:b/>
+                <w:color w:val="FFFFFF"/>
+                <w:sz w:val="20"/>
+              </w:rPr>
+            </w:r>
+            <w:r>
+              <w:rPr>
+                <w:rFonts w:ascii="Arial" w:hAnsi="Arial"/>
+                <w:b/>
+                <w:color w:val="FFFFFF"/>
+                <w:sz w:val="20"/>
+              </w:rPr>
+              <w:t>Government</w:t>
+            </w:r>
+          </w:p>
+        </w:tc>
+        <w:tc>
+          <w:tcPr>
+            <w:tcW w:type="dxa" w:w="1767"/>
+            <w:tcBorders>
+              <w:top w:val="single" w:sz="8" w:space="0" w:color="404040"/>
+              <w:left w:val="single" w:sz="8" w:space="0" w:color="404040"/>
+              <w:bottom w:val="single" w:sz="8" w:space="0" w:color="404040"/>
+              <w:right w:val="single" w:sz="8" w:space="0" w:color="404040"/>
+            </w:tcBorders>
+            <w:shd w:fill="3B9C7B" w:val="clear"/>
+          </w:tcPr>
+          <w:p>
+            <w:pPr>
+              <w:spacing w:before="80" w:after="80"/>
+              <w:jc w:val="center"/>
+            </w:pPr>
+            <w:r>
+              <w:rPr>
+                <w:rFonts w:ascii="Arial" w:hAnsi="Arial"/>
+                <w:b/>
+                <w:color w:val="FFFFFF"/>
+                <w:sz w:val="20"/>
+              </w:rPr>
+            </w:r>
+            <w:r>
+              <w:rPr>
+                <w:rFonts w:ascii="Arial" w:hAnsi="Arial"/>
+                <w:b/>
+                <w:color w:val="FFFFFF"/>
+                <w:sz w:val="20"/>
+              </w:rPr>
+              <w:t>Global</w:t>
+            </w:r>
+          </w:p>
+        </w:tc>
+        <w:tc>
+          <w:tcPr>
+            <w:tcW w:type="dxa" w:w="1767"/>
+            <w:tcBorders>
+              <w:top w:val="single" w:sz="8" w:space="0" w:color="404040"/>
+              <w:left w:val="single" w:sz="8" w:space="0" w:color="404040"/>
+              <w:bottom w:val="single" w:sz="8" w:space="0" w:color="404040"/>
+              <w:right w:val="single" w:sz="8" w:space="0" w:color="404040"/>
+            </w:tcBorders>
+            <w:shd w:fill="3B9C7B" w:val="clear"/>
+          </w:tcPr>
+          <w:p>
+            <w:pPr>
+              <w:spacing w:before="80" w:after="80"/>
+              <w:jc w:val="center"/>
+            </w:pPr>
+            <w:r>
+              <w:rPr>
+                <w:rFonts w:ascii="Arial" w:hAnsi="Arial"/>
+                <w:b/>
+                <w:color w:val="FFFFFF"/>
+                <w:sz w:val="20"/>
+              </w:rPr>
+            </w:r>
+            <w:r>
+              <w:rPr>
+                <w:rFonts w:ascii="Arial" w:hAnsi="Arial"/>
+                <w:b/>
+                <w:color w:val="FFFFFF"/>
+                <w:sz w:val="20"/>
+              </w:rPr>
+              <w:t>Total</w:t>
+            </w:r>
+          </w:p>
+        </w:tc>
+      </w:tr>
+      <w:tr>
+        <w:tc>
+          <w:tcPr>
+            <w:tcW w:type="dxa" w:w="1767"/>
+            <w:tcBorders>
+              <w:top w:val="single" w:sz="8" w:space="0" w:color="404040"/>
+              <w:left w:val="single" w:sz="8" w:space="0" w:color="404040"/>
+              <w:bottom w:val="single" w:sz="8" w:space="0" w:color="404040"/>
+              <w:right w:val="single" w:sz="8" w:space="0" w:color="404040"/>
+            </w:tcBorders>
+            <w:shd w:fill="0A5455" w:val="clear"/>
+          </w:tcPr>
+          <w:p>
+            <w:pPr>
+              <w:spacing w:before="80" w:after="80"/>
+              <w:jc w:val="left"/>
+            </w:pPr>
+            <w:r>
+              <w:rPr>
+                <w:rFonts w:ascii="Arial" w:hAnsi="Arial"/>
+                <w:b/>
+                <w:color w:val="FFFFFF"/>
+                <w:sz w:val="20"/>
+              </w:rPr>
+            </w:r>
+            <w:r>
+              <w:rPr>
+                <w:rFonts w:ascii="Arial" w:hAnsi="Arial"/>
+                <w:b/>
+                <w:color w:val="FFFFFF"/>
+                <w:sz w:val="20"/>
+              </w:rPr>
+              <w:t>Fish provisioning</w:t>
+            </w:r>
+          </w:p>
+        </w:tc>
+        <w:tc>
+          <w:tcPr>
+            <w:tcW w:type="dxa" w:w="1767"/>
+            <w:tcBorders>
+              <w:top w:val="single" w:sz="8" w:space="0" w:color="404040"/>
+              <w:left w:val="single" w:sz="8" w:space="0" w:color="404040"/>
+              <w:bottom w:val="single" w:sz="8" w:space="0" w:color="404040"/>
+              <w:right w:val="single" w:sz="8" w:space="0" w:color="404040"/>
+            </w:tcBorders>
+          </w:tcPr>
+          <w:p>
+            <w:pPr>
+              <w:spacing w:before="80" w:after="80"/>
+              <w:jc w:val="center"/>
+            </w:pPr>
+            <w:r>
+              <w:rPr>
+                <w:rFonts w:ascii="Arial" w:hAnsi="Arial"/>
+                <w:b w:val="0"/>
+                <w:color w:val="30302F"/>
+                <w:sz w:val="20"/>
+              </w:rPr>
+            </w:r>
+            <w:r>
+              <w:rPr>
+                <w:rFonts w:ascii="Arial" w:hAnsi="Arial"/>
+                <w:b w:val="0"/>
+                <w:color w:val="30302F"/>
+                <w:sz w:val="20"/>
+              </w:rPr>
+              <w:t>Resource rent</w:t>
+            </w:r>
+          </w:p>
+        </w:tc>
+        <w:tc>
+          <w:tcPr>
+            <w:tcW w:type="dxa" w:w="1767"/>
+            <w:tcBorders>
+              <w:top w:val="single" w:sz="8" w:space="0" w:color="404040"/>
+              <w:left w:val="single" w:sz="8" w:space="0" w:color="404040"/>
+              <w:bottom w:val="single" w:sz="8" w:space="0" w:color="404040"/>
+              <w:right w:val="single" w:sz="8" w:space="0" w:color="404040"/>
+            </w:tcBorders>
+          </w:tcPr>
+          <w:p>
+            <w:pPr>
+              <w:spacing w:before="80" w:after="80"/>
+              <w:jc w:val="center"/>
+            </w:pPr>
+            <w:r>
+              <w:rPr>
+                <w:rFonts w:ascii="Arial" w:hAnsi="Arial"/>
+                <w:b w:val="0"/>
+                <w:color w:val="30302F"/>
+                <w:sz w:val="20"/>
+              </w:rPr>
+            </w:r>
+            <w:r>
+              <w:rPr>
+                <w:rFonts w:ascii="Arial" w:hAnsi="Arial"/>
+                <w:b w:val="0"/>
+                <w:color w:val="30302F"/>
+                <w:sz w:val="20"/>
+              </w:rPr>
+              <w:t>210 000</w:t>
+            </w:r>
+          </w:p>
+        </w:tc>
+        <w:tc>
+          <w:tcPr>
+            <w:tcW w:type="dxa" w:w="1767"/>
+            <w:tcBorders>
+              <w:top w:val="single" w:sz="8" w:space="0" w:color="404040"/>
+              <w:left w:val="single" w:sz="8" w:space="0" w:color="404040"/>
+              <w:bottom w:val="single" w:sz="8" w:space="0" w:color="404040"/>
+              <w:right w:val="single" w:sz="8" w:space="0" w:color="404040"/>
+            </w:tcBorders>
+          </w:tcPr>
+          <w:p>
+            <w:pPr>
+              <w:spacing w:before="80" w:after="80"/>
+              <w:jc w:val="center"/>
+            </w:pPr>
+            <w:r>
+              <w:rPr>
+                <w:rFonts w:ascii="Arial" w:hAnsi="Arial"/>
+                <w:b w:val="0"/>
+                <w:color w:val="30302F"/>
+                <w:sz w:val="20"/>
+              </w:rPr>
+            </w:r>
+            <w:r>
+              <w:rPr>
+                <w:rFonts w:ascii="Arial" w:hAnsi="Arial"/>
+                <w:b w:val="0"/>
+                <w:color w:val="30302F"/>
+                <w:sz w:val="20"/>
+              </w:rPr>
+              <w:t>0</w:t>
+            </w:r>
+          </w:p>
+        </w:tc>
+        <w:tc>
+          <w:tcPr>
+            <w:tcW w:type="dxa" w:w="1767"/>
+            <w:tcBorders>
+              <w:top w:val="single" w:sz="8" w:space="0" w:color="404040"/>
+              <w:left w:val="single" w:sz="8" w:space="0" w:color="404040"/>
+              <w:bottom w:val="single" w:sz="8" w:space="0" w:color="404040"/>
+              <w:right w:val="single" w:sz="8" w:space="0" w:color="404040"/>
+            </w:tcBorders>
+          </w:tcPr>
+          <w:p>
+            <w:pPr>
+              <w:spacing w:before="80" w:after="80"/>
+              <w:jc w:val="center"/>
+            </w:pPr>
+            <w:r>
+              <w:rPr>
+                <w:rFonts w:ascii="Arial" w:hAnsi="Arial"/>
+                <w:b w:val="0"/>
+                <w:color w:val="30302F"/>
+                <w:sz w:val="20"/>
+              </w:rPr>
+            </w:r>
+            <w:r>
+              <w:rPr>
+                <w:rFonts w:ascii="Arial" w:hAnsi="Arial"/>
+                <w:b w:val="0"/>
+                <w:color w:val="30302F"/>
+                <w:sz w:val="20"/>
+              </w:rPr>
+              <w:t>0</w:t>
+            </w:r>
+          </w:p>
+        </w:tc>
+        <w:tc>
+          <w:tcPr>
+            <w:tcW w:type="dxa" w:w="1767"/>
+            <w:tcBorders>
+              <w:top w:val="single" w:sz="8" w:space="0" w:color="404040"/>
+              <w:left w:val="single" w:sz="8" w:space="0" w:color="404040"/>
+              <w:bottom w:val="single" w:sz="8" w:space="0" w:color="404040"/>
+              <w:right w:val="single" w:sz="8" w:space="0" w:color="404040"/>
+            </w:tcBorders>
+          </w:tcPr>
+          <w:p>
+            <w:pPr>
+              <w:spacing w:before="80" w:after="80"/>
+              <w:jc w:val="center"/>
+            </w:pPr>
+            <w:r>
+              <w:rPr>
+                <w:rFonts w:ascii="Arial" w:hAnsi="Arial"/>
+                <w:b w:val="0"/>
+                <w:color w:val="30302F"/>
+                <w:sz w:val="20"/>
+              </w:rPr>
+            </w:r>
+            <w:r>
+              <w:rPr>
+                <w:rFonts w:ascii="Arial" w:hAnsi="Arial"/>
+                <w:b w:val="0"/>
+                <w:color w:val="30302F"/>
+                <w:sz w:val="20"/>
+              </w:rPr>
+              <w:t>0</w:t>
+            </w:r>
+          </w:p>
+        </w:tc>
+        <w:tc>
+          <w:tcPr>
+            <w:tcW w:type="dxa" w:w="1767"/>
+            <w:tcBorders>
+              <w:top w:val="single" w:sz="8" w:space="0" w:color="404040"/>
+              <w:left w:val="single" w:sz="8" w:space="0" w:color="404040"/>
+              <w:bottom w:val="single" w:sz="8" w:space="0" w:color="404040"/>
+              <w:right w:val="single" w:sz="8" w:space="0" w:color="404040"/>
+            </w:tcBorders>
+          </w:tcPr>
+          <w:p>
+            <w:pPr>
+              <w:spacing w:before="80" w:after="80"/>
+              <w:jc w:val="center"/>
+            </w:pPr>
+            <w:r>
+              <w:rPr>
+                <w:rFonts w:ascii="Arial" w:hAnsi="Arial"/>
+                <w:b w:val="0"/>
+                <w:color w:val="30302F"/>
+                <w:sz w:val="20"/>
+              </w:rPr>
+            </w:r>
+            <w:r>
+              <w:rPr>
+                <w:rFonts w:ascii="Arial" w:hAnsi="Arial"/>
+                <w:b w:val="0"/>
+                <w:color w:val="30302F"/>
+                <w:sz w:val="20"/>
+              </w:rPr>
+              <w:t>0</w:t>
+            </w:r>
+          </w:p>
+        </w:tc>
+        <w:tc>
+          <w:tcPr>
+            <w:tcW w:type="dxa" w:w="1767"/>
+            <w:tcBorders>
+              <w:top w:val="single" w:sz="8" w:space="0" w:color="404040"/>
+              <w:left w:val="single" w:sz="8" w:space="0" w:color="404040"/>
+              <w:bottom w:val="single" w:sz="8" w:space="0" w:color="404040"/>
+              <w:right w:val="single" w:sz="8" w:space="0" w:color="404040"/>
+            </w:tcBorders>
+          </w:tcPr>
+          <w:p>
+            <w:pPr>
+              <w:spacing w:before="80" w:after="80"/>
+              <w:jc w:val="center"/>
+            </w:pPr>
+            <w:r>
+              <w:rPr>
+                <w:rFonts w:ascii="Arial" w:hAnsi="Arial"/>
+                <w:b w:val="0"/>
+                <w:color w:val="30302F"/>
+                <w:sz w:val="20"/>
+              </w:rPr>
+            </w:r>
+            <w:r>
+              <w:rPr>
+                <w:rFonts w:ascii="Arial" w:hAnsi="Arial"/>
+                <w:b w:val="0"/>
+                <w:color w:val="30302F"/>
+                <w:sz w:val="20"/>
+              </w:rPr>
+              <w:t>210 000</w:t>
+            </w:r>
+          </w:p>
+        </w:tc>
+      </w:tr>
+      <w:tr>
+        <w:tc>
+          <w:tcPr>
+            <w:tcW w:type="dxa" w:w="1767"/>
+            <w:tcBorders>
+              <w:top w:val="single" w:sz="8" w:space="0" w:color="404040"/>
+              <w:left w:val="single" w:sz="8" w:space="0" w:color="404040"/>
+              <w:bottom w:val="single" w:sz="8" w:space="0" w:color="404040"/>
+              <w:right w:val="single" w:sz="8" w:space="0" w:color="404040"/>
+            </w:tcBorders>
+            <w:shd w:fill="0A5455" w:val="clear"/>
+          </w:tcPr>
+          <w:p>
+            <w:pPr>
+              <w:spacing w:before="80" w:after="80"/>
+              <w:jc w:val="left"/>
+            </w:pPr>
+            <w:r>
+              <w:rPr>
+                <w:rFonts w:ascii="Arial" w:hAnsi="Arial"/>
+                <w:b/>
+                <w:color w:val="FFFFFF"/>
+                <w:sz w:val="20"/>
+              </w:rPr>
+            </w:r>
+            <w:r>
+              <w:rPr>
+                <w:rFonts w:ascii="Arial" w:hAnsi="Arial"/>
+                <w:b/>
+                <w:color w:val="FFFFFF"/>
+                <w:sz w:val="20"/>
+              </w:rPr>
+              <w:t>Carbon sequestration</w:t>
+            </w:r>
+          </w:p>
+        </w:tc>
+        <w:tc>
+          <w:tcPr>
+            <w:tcW w:type="dxa" w:w="1767"/>
+            <w:tcBorders>
+              <w:top w:val="single" w:sz="8" w:space="0" w:color="404040"/>
+              <w:left w:val="single" w:sz="8" w:space="0" w:color="404040"/>
+              <w:bottom w:val="single" w:sz="8" w:space="0" w:color="404040"/>
+              <w:right w:val="single" w:sz="8" w:space="0" w:color="404040"/>
+            </w:tcBorders>
+          </w:tcPr>
+          <w:p>
+            <w:pPr>
+              <w:spacing w:before="80" w:after="80"/>
+              <w:jc w:val="center"/>
+            </w:pPr>
+            <w:r>
+              <w:rPr>
+                <w:rFonts w:ascii="Arial" w:hAnsi="Arial"/>
+                <w:b w:val="0"/>
+                <w:color w:val="30302F"/>
+                <w:sz w:val="20"/>
+              </w:rPr>
+            </w:r>
+            <w:r>
+              <w:rPr>
+                <w:rFonts w:ascii="Arial" w:hAnsi="Arial"/>
+                <w:b w:val="0"/>
+                <w:color w:val="30302F"/>
+                <w:sz w:val="20"/>
+              </w:rPr>
+              <w:t>SCC</w:t>
+            </w:r>
+          </w:p>
+        </w:tc>
+        <w:tc>
+          <w:tcPr>
+            <w:tcW w:type="dxa" w:w="1767"/>
+            <w:tcBorders>
+              <w:top w:val="single" w:sz="8" w:space="0" w:color="404040"/>
+              <w:left w:val="single" w:sz="8" w:space="0" w:color="404040"/>
+              <w:bottom w:val="single" w:sz="8" w:space="0" w:color="404040"/>
+              <w:right w:val="single" w:sz="8" w:space="0" w:color="404040"/>
+            </w:tcBorders>
+          </w:tcPr>
+          <w:p>
+            <w:pPr>
+              <w:spacing w:before="80" w:after="80"/>
+              <w:jc w:val="center"/>
+            </w:pPr>
+            <w:r>
+              <w:rPr>
+                <w:rFonts w:ascii="Arial" w:hAnsi="Arial"/>
+                <w:b w:val="0"/>
+                <w:color w:val="30302F"/>
+                <w:sz w:val="20"/>
+              </w:rPr>
+            </w:r>
+            <w:r>
+              <w:rPr>
+                <w:rFonts w:ascii="Arial" w:hAnsi="Arial"/>
+                <w:b w:val="0"/>
+                <w:color w:val="30302F"/>
+                <w:sz w:val="20"/>
+              </w:rPr>
+              <w:t>0</w:t>
+            </w:r>
+          </w:p>
+        </w:tc>
+        <w:tc>
+          <w:tcPr>
+            <w:tcW w:type="dxa" w:w="1767"/>
+            <w:tcBorders>
+              <w:top w:val="single" w:sz="8" w:space="0" w:color="404040"/>
+              <w:left w:val="single" w:sz="8" w:space="0" w:color="404040"/>
+              <w:bottom w:val="single" w:sz="8" w:space="0" w:color="404040"/>
+              <w:right w:val="single" w:sz="8" w:space="0" w:color="404040"/>
+            </w:tcBorders>
+          </w:tcPr>
+          <w:p>
+            <w:pPr>
+              <w:spacing w:before="80" w:after="80"/>
+              <w:jc w:val="center"/>
+            </w:pPr>
+            <w:r>
+              <w:rPr>
+                <w:rFonts w:ascii="Arial" w:hAnsi="Arial"/>
+                <w:b w:val="0"/>
+                <w:color w:val="30302F"/>
+                <w:sz w:val="20"/>
+              </w:rPr>
+            </w:r>
+            <w:r>
+              <w:rPr>
+                <w:rFonts w:ascii="Arial" w:hAnsi="Arial"/>
+                <w:b w:val="0"/>
+                <w:color w:val="30302F"/>
+                <w:sz w:val="20"/>
+              </w:rPr>
+              <w:t>0</w:t>
+            </w:r>
+          </w:p>
+        </w:tc>
+        <w:tc>
+          <w:tcPr>
+            <w:tcW w:type="dxa" w:w="1767"/>
+            <w:tcBorders>
+              <w:top w:val="single" w:sz="8" w:space="0" w:color="404040"/>
+              <w:left w:val="single" w:sz="8" w:space="0" w:color="404040"/>
+              <w:bottom w:val="single" w:sz="8" w:space="0" w:color="404040"/>
+              <w:right w:val="single" w:sz="8" w:space="0" w:color="404040"/>
+            </w:tcBorders>
+          </w:tcPr>
+          <w:p>
+            <w:pPr>
+              <w:spacing w:before="80" w:after="80"/>
+              <w:jc w:val="center"/>
+            </w:pPr>
+            <w:r>
+              <w:rPr>
+                <w:rFonts w:ascii="Arial" w:hAnsi="Arial"/>
+                <w:b w:val="0"/>
+                <w:color w:val="30302F"/>
+                <w:sz w:val="20"/>
+              </w:rPr>
+            </w:r>
+            <w:r>
+              <w:rPr>
+                <w:rFonts w:ascii="Arial" w:hAnsi="Arial"/>
+                <w:b w:val="0"/>
+                <w:color w:val="30302F"/>
+                <w:sz w:val="20"/>
+              </w:rPr>
+              <w:t>0</w:t>
+            </w:r>
+          </w:p>
+        </w:tc>
+        <w:tc>
+          <w:tcPr>
+            <w:tcW w:type="dxa" w:w="1767"/>
+            <w:tcBorders>
+              <w:top w:val="single" w:sz="8" w:space="0" w:color="404040"/>
+              <w:left w:val="single" w:sz="8" w:space="0" w:color="404040"/>
+              <w:bottom w:val="single" w:sz="8" w:space="0" w:color="404040"/>
+              <w:right w:val="single" w:sz="8" w:space="0" w:color="404040"/>
+            </w:tcBorders>
+          </w:tcPr>
+          <w:p>
+            <w:pPr>
+              <w:spacing w:before="80" w:after="80"/>
+              <w:jc w:val="center"/>
+            </w:pPr>
+            <w:r>
+              <w:rPr>
+                <w:rFonts w:ascii="Arial" w:hAnsi="Arial"/>
+                <w:b w:val="0"/>
+                <w:color w:val="30302F"/>
+                <w:sz w:val="20"/>
+              </w:rPr>
+            </w:r>
+            <w:r>
+              <w:rPr>
+                <w:rFonts w:ascii="Arial" w:hAnsi="Arial"/>
+                <w:b w:val="0"/>
+                <w:color w:val="30302F"/>
+                <w:sz w:val="20"/>
+              </w:rPr>
+              <w:t>0</w:t>
+            </w:r>
+          </w:p>
+        </w:tc>
+        <w:tc>
+          <w:tcPr>
+            <w:tcW w:type="dxa" w:w="1767"/>
+            <w:tcBorders>
+              <w:top w:val="single" w:sz="8" w:space="0" w:color="404040"/>
+              <w:left w:val="single" w:sz="8" w:space="0" w:color="404040"/>
+              <w:bottom w:val="single" w:sz="8" w:space="0" w:color="404040"/>
+              <w:right w:val="single" w:sz="8" w:space="0" w:color="404040"/>
+            </w:tcBorders>
+          </w:tcPr>
+          <w:p>
+            <w:pPr>
+              <w:spacing w:before="80" w:after="80"/>
+              <w:jc w:val="center"/>
+            </w:pPr>
+            <w:r>
+              <w:rPr>
+                <w:rFonts w:ascii="Arial" w:hAnsi="Arial"/>
+                <w:b w:val="0"/>
+                <w:color w:val="30302F"/>
+                <w:sz w:val="20"/>
+              </w:rPr>
+            </w:r>
+            <w:r>
+              <w:rPr>
+                <w:rFonts w:ascii="Arial" w:hAnsi="Arial"/>
+                <w:b w:val="0"/>
+                <w:color w:val="30302F"/>
+                <w:sz w:val="20"/>
+              </w:rPr>
+              <w:t>119 085</w:t>
+            </w:r>
+          </w:p>
+        </w:tc>
+        <w:tc>
+          <w:tcPr>
+            <w:tcW w:type="dxa" w:w="1767"/>
+            <w:tcBorders>
+              <w:top w:val="single" w:sz="8" w:space="0" w:color="404040"/>
+              <w:left w:val="single" w:sz="8" w:space="0" w:color="404040"/>
+              <w:bottom w:val="single" w:sz="8" w:space="0" w:color="404040"/>
+              <w:right w:val="single" w:sz="8" w:space="0" w:color="404040"/>
+            </w:tcBorders>
+          </w:tcPr>
+          <w:p>
+            <w:pPr>
+              <w:spacing w:before="80" w:after="80"/>
+              <w:jc w:val="center"/>
+            </w:pPr>
+            <w:r>
+              <w:rPr>
+                <w:rFonts w:ascii="Arial" w:hAnsi="Arial"/>
+                <w:b w:val="0"/>
+                <w:color w:val="30302F"/>
+                <w:sz w:val="20"/>
+              </w:rPr>
+            </w:r>
+            <w:r>
+              <w:rPr>
+                <w:rFonts w:ascii="Arial" w:hAnsi="Arial"/>
+                <w:b w:val="0"/>
+                <w:color w:val="30302F"/>
+                <w:sz w:val="20"/>
+              </w:rPr>
+              <w:t>119 085</w:t>
+            </w:r>
+          </w:p>
+        </w:tc>
+      </w:tr>
+      <w:tr>
+        <w:tc>
+          <w:tcPr>
+            <w:tcW w:type="dxa" w:w="1767"/>
+            <w:tcBorders>
+              <w:top w:val="single" w:sz="8" w:space="0" w:color="404040"/>
+              <w:left w:val="single" w:sz="8" w:space="0" w:color="404040"/>
+              <w:bottom w:val="single" w:sz="8" w:space="0" w:color="404040"/>
+              <w:right w:val="single" w:sz="8" w:space="0" w:color="404040"/>
+            </w:tcBorders>
+            <w:shd w:fill="0A5455" w:val="clear"/>
+          </w:tcPr>
+          <w:p>
+            <w:pPr>
+              <w:spacing w:before="80" w:after="80"/>
+              <w:jc w:val="left"/>
+            </w:pPr>
+            <w:r>
+              <w:rPr>
+                <w:rFonts w:ascii="Arial" w:hAnsi="Arial"/>
+                <w:b/>
+                <w:color w:val="FFFFFF"/>
+                <w:sz w:val="20"/>
+              </w:rPr>
+            </w:r>
+            <w:r>
+              <w:rPr>
+                <w:rFonts w:ascii="Arial" w:hAnsi="Arial"/>
+                <w:b/>
+                <w:color w:val="FFFFFF"/>
+                <w:sz w:val="20"/>
+              </w:rPr>
+              <w:t>Coastal protection</w:t>
+            </w:r>
+          </w:p>
+        </w:tc>
+        <w:tc>
+          <w:tcPr>
+            <w:tcW w:type="dxa" w:w="1767"/>
+            <w:tcBorders>
+              <w:top w:val="single" w:sz="8" w:space="0" w:color="404040"/>
+              <w:left w:val="single" w:sz="8" w:space="0" w:color="404040"/>
+              <w:bottom w:val="single" w:sz="8" w:space="0" w:color="404040"/>
+              <w:right w:val="single" w:sz="8" w:space="0" w:color="404040"/>
+            </w:tcBorders>
+          </w:tcPr>
+          <w:p>
+            <w:pPr>
+              <w:spacing w:before="80" w:after="80"/>
+              <w:jc w:val="center"/>
+            </w:pPr>
+            <w:r>
+              <w:rPr>
+                <w:rFonts w:ascii="Arial" w:hAnsi="Arial"/>
+                <w:b w:val="0"/>
+                <w:color w:val="30302F"/>
+                <w:sz w:val="20"/>
+              </w:rPr>
+            </w:r>
+            <w:r>
+              <w:rPr>
+                <w:rFonts w:ascii="Arial" w:hAnsi="Arial"/>
+                <w:b w:val="0"/>
+                <w:color w:val="30302F"/>
+                <w:sz w:val="20"/>
+              </w:rPr>
+              <w:t>Replacement cost</w:t>
+            </w:r>
+          </w:p>
+        </w:tc>
+        <w:tc>
+          <w:tcPr>
+            <w:tcW w:type="dxa" w:w="1767"/>
+            <w:tcBorders>
+              <w:top w:val="single" w:sz="8" w:space="0" w:color="404040"/>
+              <w:left w:val="single" w:sz="8" w:space="0" w:color="404040"/>
+              <w:bottom w:val="single" w:sz="8" w:space="0" w:color="404040"/>
+              <w:right w:val="single" w:sz="8" w:space="0" w:color="404040"/>
+            </w:tcBorders>
+          </w:tcPr>
+          <w:p>
+            <w:pPr>
+              <w:spacing w:before="80" w:after="80"/>
+              <w:jc w:val="center"/>
+            </w:pPr>
+            <w:r>
+              <w:rPr>
+                <w:rFonts w:ascii="Arial" w:hAnsi="Arial"/>
+                <w:b w:val="0"/>
+                <w:color w:val="30302F"/>
+                <w:sz w:val="20"/>
+              </w:rPr>
+            </w:r>
+            <w:r>
+              <w:rPr>
+                <w:rFonts w:ascii="Arial" w:hAnsi="Arial"/>
+                <w:b w:val="0"/>
+                <w:color w:val="30302F"/>
+                <w:sz w:val="20"/>
+              </w:rPr>
+              <w:t>0</w:t>
+            </w:r>
+          </w:p>
+        </w:tc>
+        <w:tc>
+          <w:tcPr>
+            <w:tcW w:type="dxa" w:w="1767"/>
+            <w:tcBorders>
+              <w:top w:val="single" w:sz="8" w:space="0" w:color="404040"/>
+              <w:left w:val="single" w:sz="8" w:space="0" w:color="404040"/>
+              <w:bottom w:val="single" w:sz="8" w:space="0" w:color="404040"/>
+              <w:right w:val="single" w:sz="8" w:space="0" w:color="404040"/>
+            </w:tcBorders>
+          </w:tcPr>
+          <w:p>
+            <w:pPr>
+              <w:spacing w:before="80" w:after="80"/>
+              <w:jc w:val="center"/>
+            </w:pPr>
+            <w:r>
+              <w:rPr>
+                <w:rFonts w:ascii="Arial" w:hAnsi="Arial"/>
+                <w:b w:val="0"/>
+                <w:color w:val="30302F"/>
+                <w:sz w:val="20"/>
+              </w:rPr>
+            </w:r>
+            <w:r>
+              <w:rPr>
+                <w:rFonts w:ascii="Arial" w:hAnsi="Arial"/>
+                <w:b w:val="0"/>
+                <w:color w:val="30302F"/>
+                <w:sz w:val="20"/>
+              </w:rPr>
+              <w:t>0</w:t>
+            </w:r>
+          </w:p>
+        </w:tc>
+        <w:tc>
+          <w:tcPr>
+            <w:tcW w:type="dxa" w:w="1767"/>
+            <w:tcBorders>
+              <w:top w:val="single" w:sz="8" w:space="0" w:color="404040"/>
+              <w:left w:val="single" w:sz="8" w:space="0" w:color="404040"/>
+              <w:bottom w:val="single" w:sz="8" w:space="0" w:color="404040"/>
+              <w:right w:val="single" w:sz="8" w:space="0" w:color="404040"/>
+            </w:tcBorders>
+          </w:tcPr>
+          <w:p>
+            <w:pPr>
+              <w:spacing w:before="80" w:after="80"/>
+              <w:jc w:val="center"/>
+            </w:pPr>
+            <w:r>
+              <w:rPr>
+                <w:rFonts w:ascii="Arial" w:hAnsi="Arial"/>
+                <w:b w:val="0"/>
+                <w:color w:val="30302F"/>
+                <w:sz w:val="20"/>
+              </w:rPr>
+            </w:r>
+            <w:r>
+              <w:rPr>
+                <w:rFonts w:ascii="Arial" w:hAnsi="Arial"/>
+                <w:b w:val="0"/>
+                <w:color w:val="30302F"/>
+                <w:sz w:val="20"/>
+              </w:rPr>
+              <w:t>880 000</w:t>
+            </w:r>
+          </w:p>
+        </w:tc>
+        <w:tc>
+          <w:tcPr>
+            <w:tcW w:type="dxa" w:w="1767"/>
+            <w:tcBorders>
+              <w:top w:val="single" w:sz="8" w:space="0" w:color="404040"/>
+              <w:left w:val="single" w:sz="8" w:space="0" w:color="404040"/>
+              <w:bottom w:val="single" w:sz="8" w:space="0" w:color="404040"/>
+              <w:right w:val="single" w:sz="8" w:space="0" w:color="404040"/>
+            </w:tcBorders>
+          </w:tcPr>
+          <w:p>
+            <w:pPr>
+              <w:spacing w:before="80" w:after="80"/>
+              <w:jc w:val="center"/>
+            </w:pPr>
+            <w:r>
+              <w:rPr>
+                <w:rFonts w:ascii="Arial" w:hAnsi="Arial"/>
+                <w:b w:val="0"/>
+                <w:color w:val="30302F"/>
+                <w:sz w:val="20"/>
+              </w:rPr>
+            </w:r>
+            <w:r>
+              <w:rPr>
+                <w:rFonts w:ascii="Arial" w:hAnsi="Arial"/>
+                <w:b w:val="0"/>
+                <w:color w:val="30302F"/>
+                <w:sz w:val="20"/>
+              </w:rPr>
+              <w:t>495 000</w:t>
+            </w:r>
+          </w:p>
+        </w:tc>
+        <w:tc>
+          <w:tcPr>
+            <w:tcW w:type="dxa" w:w="1767"/>
+            <w:tcBorders>
+              <w:top w:val="single" w:sz="8" w:space="0" w:color="404040"/>
+              <w:left w:val="single" w:sz="8" w:space="0" w:color="404040"/>
+              <w:bottom w:val="single" w:sz="8" w:space="0" w:color="404040"/>
+              <w:right w:val="single" w:sz="8" w:space="0" w:color="404040"/>
+            </w:tcBorders>
+          </w:tcPr>
+          <w:p>
+            <w:pPr>
+              <w:spacing w:before="80" w:after="80"/>
+              <w:jc w:val="center"/>
+            </w:pPr>
+            <w:r>
+              <w:rPr>
+                <w:rFonts w:ascii="Arial" w:hAnsi="Arial"/>
+                <w:b w:val="0"/>
+                <w:color w:val="30302F"/>
+                <w:sz w:val="20"/>
+              </w:rPr>
+            </w:r>
+            <w:r>
+              <w:rPr>
+                <w:rFonts w:ascii="Arial" w:hAnsi="Arial"/>
+                <w:b w:val="0"/>
+                <w:color w:val="30302F"/>
+                <w:sz w:val="20"/>
+              </w:rPr>
+              <w:t>0</w:t>
+            </w:r>
+          </w:p>
+        </w:tc>
+        <w:tc>
+          <w:tcPr>
+            <w:tcW w:type="dxa" w:w="1767"/>
+            <w:tcBorders>
+              <w:top w:val="single" w:sz="8" w:space="0" w:color="404040"/>
+              <w:left w:val="single" w:sz="8" w:space="0" w:color="404040"/>
+              <w:bottom w:val="single" w:sz="8" w:space="0" w:color="404040"/>
+              <w:right w:val="single" w:sz="8" w:space="0" w:color="404040"/>
+            </w:tcBorders>
+          </w:tcPr>
+          <w:p>
+            <w:pPr>
+              <w:spacing w:before="80" w:after="80"/>
+              <w:jc w:val="center"/>
+            </w:pPr>
+            <w:r>
+              <w:rPr>
+                <w:rFonts w:ascii="Arial" w:hAnsi="Arial"/>
+                <w:b w:val="0"/>
+                <w:color w:val="30302F"/>
+                <w:sz w:val="20"/>
+              </w:rPr>
+            </w:r>
+            <w:r>
+              <w:rPr>
+                <w:rFonts w:ascii="Arial" w:hAnsi="Arial"/>
+                <w:b w:val="0"/>
+                <w:color w:val="30302F"/>
+                <w:sz w:val="20"/>
+              </w:rPr>
+              <w:t>1 375 000</w:t>
+            </w:r>
+          </w:p>
+        </w:tc>
+      </w:tr>
+      <w:tr>
+        <w:tc>
+          <w:tcPr>
+            <w:tcW w:type="dxa" w:w="1767"/>
+            <w:tcBorders>
+              <w:top w:val="single" w:sz="8" w:space="0" w:color="404040"/>
+              <w:left w:val="single" w:sz="8" w:space="0" w:color="404040"/>
+              <w:bottom w:val="single" w:sz="8" w:space="0" w:color="404040"/>
+              <w:right w:val="single" w:sz="8" w:space="0" w:color="404040"/>
+            </w:tcBorders>
+            <w:shd w:fill="0A5455" w:val="clear"/>
+          </w:tcPr>
+          <w:p>
+            <w:pPr>
+              <w:spacing w:before="80" w:after="80"/>
+              <w:jc w:val="left"/>
+            </w:pPr>
+            <w:r>
+              <w:rPr>
+                <w:rFonts w:ascii="Arial" w:hAnsi="Arial"/>
+                <w:b/>
+                <w:color w:val="FFFFFF"/>
+                <w:sz w:val="20"/>
+              </w:rPr>
+            </w:r>
+            <w:r>
+              <w:rPr>
+                <w:rFonts w:ascii="Arial" w:hAnsi="Arial"/>
+                <w:b/>
+                <w:color w:val="FFFFFF"/>
+                <w:sz w:val="20"/>
+              </w:rPr>
+              <w:t>Nursery habitat</w:t>
+            </w:r>
+          </w:p>
+        </w:tc>
+        <w:tc>
+          <w:tcPr>
+            <w:tcW w:type="dxa" w:w="1767"/>
+            <w:tcBorders>
+              <w:top w:val="single" w:sz="8" w:space="0" w:color="404040"/>
+              <w:left w:val="single" w:sz="8" w:space="0" w:color="404040"/>
+              <w:bottom w:val="single" w:sz="8" w:space="0" w:color="404040"/>
+              <w:right w:val="single" w:sz="8" w:space="0" w:color="404040"/>
+            </w:tcBorders>
+          </w:tcPr>
+          <w:p>
+            <w:pPr>
+              <w:spacing w:before="80" w:after="80"/>
+              <w:jc w:val="center"/>
+            </w:pPr>
+            <w:r>
+              <w:rPr>
+                <w:rFonts w:ascii="Arial" w:hAnsi="Arial"/>
+                <w:b w:val="0"/>
+                <w:color w:val="30302F"/>
+                <w:sz w:val="20"/>
+              </w:rPr>
+            </w:r>
+            <w:r>
+              <w:rPr>
+                <w:rFonts w:ascii="Arial" w:hAnsi="Arial"/>
+                <w:b w:val="0"/>
+                <w:color w:val="30302F"/>
+                <w:sz w:val="20"/>
+              </w:rPr>
+              <w:t>Productivity change</w:t>
+            </w:r>
+          </w:p>
+        </w:tc>
+        <w:tc>
+          <w:tcPr>
+            <w:tcW w:type="dxa" w:w="1767"/>
+            <w:tcBorders>
+              <w:top w:val="single" w:sz="8" w:space="0" w:color="404040"/>
+              <w:left w:val="single" w:sz="8" w:space="0" w:color="404040"/>
+              <w:bottom w:val="single" w:sz="8" w:space="0" w:color="404040"/>
+              <w:right w:val="single" w:sz="8" w:space="0" w:color="404040"/>
+            </w:tcBorders>
+          </w:tcPr>
+          <w:p>
+            <w:pPr>
+              <w:spacing w:before="80" w:after="80"/>
+              <w:jc w:val="center"/>
+            </w:pPr>
+            <w:r>
+              <w:rPr>
+                <w:rFonts w:ascii="Arial" w:hAnsi="Arial"/>
+                <w:b w:val="0"/>
+                <w:color w:val="30302F"/>
+                <w:sz w:val="20"/>
+              </w:rPr>
+            </w:r>
+            <w:r>
+              <w:rPr>
+                <w:rFonts w:ascii="Arial" w:hAnsi="Arial"/>
+                <w:b w:val="0"/>
+                <w:color w:val="30302F"/>
+                <w:sz w:val="20"/>
+              </w:rPr>
+              <w:t>127 750</w:t>
+            </w:r>
+          </w:p>
+        </w:tc>
+        <w:tc>
+          <w:tcPr>
+            <w:tcW w:type="dxa" w:w="1767"/>
+            <w:tcBorders>
+              <w:top w:val="single" w:sz="8" w:space="0" w:color="404040"/>
+              <w:left w:val="single" w:sz="8" w:space="0" w:color="404040"/>
+              <w:bottom w:val="single" w:sz="8" w:space="0" w:color="404040"/>
+              <w:right w:val="single" w:sz="8" w:space="0" w:color="404040"/>
+            </w:tcBorders>
+          </w:tcPr>
+          <w:p>
+            <w:pPr>
+              <w:spacing w:before="80" w:after="80"/>
+              <w:jc w:val="center"/>
+            </w:pPr>
+            <w:r>
+              <w:rPr>
+                <w:rFonts w:ascii="Arial" w:hAnsi="Arial"/>
+                <w:b w:val="0"/>
+                <w:color w:val="30302F"/>
+                <w:sz w:val="20"/>
+              </w:rPr>
+            </w:r>
+            <w:r>
+              <w:rPr>
+                <w:rFonts w:ascii="Arial" w:hAnsi="Arial"/>
+                <w:b w:val="0"/>
+                <w:color w:val="30302F"/>
+                <w:sz w:val="20"/>
+              </w:rPr>
+              <w:t>0</w:t>
+            </w:r>
+          </w:p>
+        </w:tc>
+        <w:tc>
+          <w:tcPr>
+            <w:tcW w:type="dxa" w:w="1767"/>
+            <w:tcBorders>
+              <w:top w:val="single" w:sz="8" w:space="0" w:color="404040"/>
+              <w:left w:val="single" w:sz="8" w:space="0" w:color="404040"/>
+              <w:bottom w:val="single" w:sz="8" w:space="0" w:color="404040"/>
+              <w:right w:val="single" w:sz="8" w:space="0" w:color="404040"/>
+            </w:tcBorders>
+          </w:tcPr>
+          <w:p>
+            <w:pPr>
+              <w:spacing w:before="80" w:after="80"/>
+              <w:jc w:val="center"/>
+            </w:pPr>
+            <w:r>
+              <w:rPr>
+                <w:rFonts w:ascii="Arial" w:hAnsi="Arial"/>
+                <w:b w:val="0"/>
+                <w:color w:val="30302F"/>
+                <w:sz w:val="20"/>
+              </w:rPr>
+            </w:r>
+            <w:r>
+              <w:rPr>
+                <w:rFonts w:ascii="Arial" w:hAnsi="Arial"/>
+                <w:b w:val="0"/>
+                <w:color w:val="30302F"/>
+                <w:sz w:val="20"/>
+              </w:rPr>
+              <w:t>0</w:t>
+            </w:r>
+          </w:p>
+        </w:tc>
+        <w:tc>
+          <w:tcPr>
+            <w:tcW w:type="dxa" w:w="1767"/>
+            <w:tcBorders>
+              <w:top w:val="single" w:sz="8" w:space="0" w:color="404040"/>
+              <w:left w:val="single" w:sz="8" w:space="0" w:color="404040"/>
+              <w:bottom w:val="single" w:sz="8" w:space="0" w:color="404040"/>
+              <w:right w:val="single" w:sz="8" w:space="0" w:color="404040"/>
+            </w:tcBorders>
+          </w:tcPr>
+          <w:p>
+            <w:pPr>
+              <w:spacing w:before="80" w:after="80"/>
+              <w:jc w:val="center"/>
+            </w:pPr>
+            <w:r>
+              <w:rPr>
+                <w:rFonts w:ascii="Arial" w:hAnsi="Arial"/>
+                <w:b w:val="0"/>
+                <w:color w:val="30302F"/>
+                <w:sz w:val="20"/>
+              </w:rPr>
+            </w:r>
+            <w:r>
+              <w:rPr>
+                <w:rFonts w:ascii="Arial" w:hAnsi="Arial"/>
+                <w:b w:val="0"/>
+                <w:color w:val="30302F"/>
+                <w:sz w:val="20"/>
+              </w:rPr>
+              <w:t>0</w:t>
+            </w:r>
+          </w:p>
+        </w:tc>
+        <w:tc>
+          <w:tcPr>
+            <w:tcW w:type="dxa" w:w="1767"/>
+            <w:tcBorders>
+              <w:top w:val="single" w:sz="8" w:space="0" w:color="404040"/>
+              <w:left w:val="single" w:sz="8" w:space="0" w:color="404040"/>
+              <w:bottom w:val="single" w:sz="8" w:space="0" w:color="404040"/>
+              <w:right w:val="single" w:sz="8" w:space="0" w:color="404040"/>
+            </w:tcBorders>
+          </w:tcPr>
+          <w:p>
+            <w:pPr>
+              <w:spacing w:before="80" w:after="80"/>
+              <w:jc w:val="center"/>
+            </w:pPr>
+            <w:r>
+              <w:rPr>
+                <w:rFonts w:ascii="Arial" w:hAnsi="Arial"/>
+                <w:b w:val="0"/>
+                <w:color w:val="30302F"/>
+                <w:sz w:val="20"/>
+              </w:rPr>
+            </w:r>
+            <w:r>
+              <w:rPr>
+                <w:rFonts w:ascii="Arial" w:hAnsi="Arial"/>
+                <w:b w:val="0"/>
+                <w:color w:val="30302F"/>
+                <w:sz w:val="20"/>
+              </w:rPr>
+              <w:t>0</w:t>
+            </w:r>
+          </w:p>
+        </w:tc>
+        <w:tc>
+          <w:tcPr>
+            <w:tcW w:type="dxa" w:w="1767"/>
+            <w:tcBorders>
+              <w:top w:val="single" w:sz="8" w:space="0" w:color="404040"/>
+              <w:left w:val="single" w:sz="8" w:space="0" w:color="404040"/>
+              <w:bottom w:val="single" w:sz="8" w:space="0" w:color="404040"/>
+              <w:right w:val="single" w:sz="8" w:space="0" w:color="404040"/>
+            </w:tcBorders>
+          </w:tcPr>
+          <w:p>
+            <w:pPr>
+              <w:spacing w:before="80" w:after="80"/>
+              <w:jc w:val="center"/>
+            </w:pPr>
+            <w:r>
+              <w:rPr>
+                <w:rFonts w:ascii="Arial" w:hAnsi="Arial"/>
+                <w:b w:val="0"/>
+                <w:color w:val="30302F"/>
+                <w:sz w:val="20"/>
+              </w:rPr>
+            </w:r>
+            <w:r>
+              <w:rPr>
+                <w:rFonts w:ascii="Arial" w:hAnsi="Arial"/>
+                <w:b w:val="0"/>
+                <w:color w:val="30302F"/>
+                <w:sz w:val="20"/>
+              </w:rPr>
+              <w:t>127 750</w:t>
+            </w:r>
+          </w:p>
+        </w:tc>
+      </w:tr>
+      <w:tr>
+        <w:tc>
+          <w:tcPr>
+            <w:tcW w:type="dxa" w:w="1767"/>
+            <w:tcBorders>
+              <w:top w:val="single" w:sz="8" w:space="0" w:color="404040"/>
+              <w:left w:val="single" w:sz="8" w:space="0" w:color="404040"/>
+              <w:bottom w:val="single" w:sz="8" w:space="0" w:color="404040"/>
+              <w:right w:val="single" w:sz="8" w:space="0" w:color="404040"/>
+            </w:tcBorders>
+            <w:shd w:fill="0A5455" w:val="clear"/>
+          </w:tcPr>
+          <w:p>
+            <w:pPr>
+              <w:spacing w:before="80" w:after="80"/>
+              <w:jc w:val="left"/>
+            </w:pPr>
+            <w:r>
+              <w:rPr>
+                <w:rFonts w:ascii="Arial" w:hAnsi="Arial"/>
+                <w:b/>
+                <w:color w:val="FFFFFF"/>
+                <w:sz w:val="20"/>
+              </w:rPr>
+            </w:r>
+            <w:r>
+              <w:rPr>
+                <w:rFonts w:ascii="Arial" w:hAnsi="Arial"/>
+                <w:b/>
+                <w:color w:val="FFFFFF"/>
+                <w:sz w:val="20"/>
+              </w:rPr>
+              <w:t>Recreation</w:t>
+            </w:r>
+          </w:p>
+        </w:tc>
+        <w:tc>
+          <w:tcPr>
+            <w:tcW w:type="dxa" w:w="1767"/>
+            <w:tcBorders>
+              <w:top w:val="single" w:sz="8" w:space="0" w:color="404040"/>
+              <w:left w:val="single" w:sz="8" w:space="0" w:color="404040"/>
+              <w:bottom w:val="single" w:sz="8" w:space="0" w:color="404040"/>
+              <w:right w:val="single" w:sz="8" w:space="0" w:color="404040"/>
+            </w:tcBorders>
+          </w:tcPr>
+          <w:p>
+            <w:pPr>
+              <w:spacing w:before="80" w:after="80"/>
+              <w:jc w:val="center"/>
+            </w:pPr>
+            <w:r>
+              <w:rPr>
+                <w:rFonts w:ascii="Arial" w:hAnsi="Arial"/>
+                <w:b w:val="0"/>
+                <w:color w:val="30302F"/>
+                <w:sz w:val="20"/>
+              </w:rPr>
+            </w:r>
+            <w:r>
+              <w:rPr>
+                <w:rFonts w:ascii="Arial" w:hAnsi="Arial"/>
+                <w:b w:val="0"/>
+                <w:color w:val="30302F"/>
+                <w:sz w:val="20"/>
+              </w:rPr>
+              <w:t>Expenditure</w:t>
+            </w:r>
+          </w:p>
+        </w:tc>
+        <w:tc>
+          <w:tcPr>
+            <w:tcW w:type="dxa" w:w="1767"/>
+            <w:tcBorders>
+              <w:top w:val="single" w:sz="8" w:space="0" w:color="404040"/>
+              <w:left w:val="single" w:sz="8" w:space="0" w:color="404040"/>
+              <w:bottom w:val="single" w:sz="8" w:space="0" w:color="404040"/>
+              <w:right w:val="single" w:sz="8" w:space="0" w:color="404040"/>
+            </w:tcBorders>
+          </w:tcPr>
+          <w:p>
+            <w:pPr>
+              <w:spacing w:before="80" w:after="80"/>
+              <w:jc w:val="center"/>
+            </w:pPr>
+            <w:r>
+              <w:rPr>
+                <w:rFonts w:ascii="Arial" w:hAnsi="Arial"/>
+                <w:b w:val="0"/>
+                <w:color w:val="30302F"/>
+                <w:sz w:val="20"/>
+              </w:rPr>
+            </w:r>
+            <w:r>
+              <w:rPr>
+                <w:rFonts w:ascii="Arial" w:hAnsi="Arial"/>
+                <w:b w:val="0"/>
+                <w:color w:val="30302F"/>
+                <w:sz w:val="20"/>
+              </w:rPr>
+              <w:t>0</w:t>
+            </w:r>
+          </w:p>
+        </w:tc>
+        <w:tc>
+          <w:tcPr>
+            <w:tcW w:type="dxa" w:w="1767"/>
+            <w:tcBorders>
+              <w:top w:val="single" w:sz="8" w:space="0" w:color="404040"/>
+              <w:left w:val="single" w:sz="8" w:space="0" w:color="404040"/>
+              <w:bottom w:val="single" w:sz="8" w:space="0" w:color="404040"/>
+              <w:right w:val="single" w:sz="8" w:space="0" w:color="404040"/>
+            </w:tcBorders>
+          </w:tcPr>
+          <w:p>
+            <w:pPr>
+              <w:spacing w:before="80" w:after="80"/>
+              <w:jc w:val="center"/>
+            </w:pPr>
+            <w:r>
+              <w:rPr>
+                <w:rFonts w:ascii="Arial" w:hAnsi="Arial"/>
+                <w:b w:val="0"/>
+                <w:color w:val="30302F"/>
+                <w:sz w:val="20"/>
+              </w:rPr>
+            </w:r>
+            <w:r>
+              <w:rPr>
+                <w:rFonts w:ascii="Arial" w:hAnsi="Arial"/>
+                <w:b w:val="0"/>
+                <w:color w:val="30302F"/>
+                <w:sz w:val="20"/>
+              </w:rPr>
+              <w:t>1 275 000</w:t>
+            </w:r>
+          </w:p>
+        </w:tc>
+        <w:tc>
+          <w:tcPr>
+            <w:tcW w:type="dxa" w:w="1767"/>
+            <w:tcBorders>
+              <w:top w:val="single" w:sz="8" w:space="0" w:color="404040"/>
+              <w:left w:val="single" w:sz="8" w:space="0" w:color="404040"/>
+              <w:bottom w:val="single" w:sz="8" w:space="0" w:color="404040"/>
+              <w:right w:val="single" w:sz="8" w:space="0" w:color="404040"/>
+            </w:tcBorders>
+          </w:tcPr>
+          <w:p>
+            <w:pPr>
+              <w:spacing w:before="80" w:after="80"/>
+              <w:jc w:val="center"/>
+            </w:pPr>
+            <w:r>
+              <w:rPr>
+                <w:rFonts w:ascii="Arial" w:hAnsi="Arial"/>
+                <w:b w:val="0"/>
+                <w:color w:val="30302F"/>
+                <w:sz w:val="20"/>
+              </w:rPr>
+            </w:r>
+            <w:r>
+              <w:rPr>
+                <w:rFonts w:ascii="Arial" w:hAnsi="Arial"/>
+                <w:b w:val="0"/>
+                <w:color w:val="30302F"/>
+                <w:sz w:val="20"/>
+              </w:rPr>
+              <w:t>84 000</w:t>
+            </w:r>
+          </w:p>
+        </w:tc>
+        <w:tc>
+          <w:tcPr>
+            <w:tcW w:type="dxa" w:w="1767"/>
+            <w:tcBorders>
+              <w:top w:val="single" w:sz="8" w:space="0" w:color="404040"/>
+              <w:left w:val="single" w:sz="8" w:space="0" w:color="404040"/>
+              <w:bottom w:val="single" w:sz="8" w:space="0" w:color="404040"/>
+              <w:right w:val="single" w:sz="8" w:space="0" w:color="404040"/>
+            </w:tcBorders>
+          </w:tcPr>
+          <w:p>
+            <w:pPr>
+              <w:spacing w:before="80" w:after="80"/>
+              <w:jc w:val="center"/>
+            </w:pPr>
+            <w:r>
+              <w:rPr>
+                <w:rFonts w:ascii="Arial" w:hAnsi="Arial"/>
+                <w:b w:val="0"/>
+                <w:color w:val="30302F"/>
+                <w:sz w:val="20"/>
+              </w:rPr>
+            </w:r>
+            <w:r>
+              <w:rPr>
+                <w:rFonts w:ascii="Arial" w:hAnsi="Arial"/>
+                <w:b w:val="0"/>
+                <w:color w:val="30302F"/>
+                <w:sz w:val="20"/>
+              </w:rPr>
+              <w:t>0</w:t>
+            </w:r>
+          </w:p>
+        </w:tc>
+        <w:tc>
+          <w:tcPr>
+            <w:tcW w:type="dxa" w:w="1767"/>
+            <w:tcBorders>
+              <w:top w:val="single" w:sz="8" w:space="0" w:color="404040"/>
+              <w:left w:val="single" w:sz="8" w:space="0" w:color="404040"/>
+              <w:bottom w:val="single" w:sz="8" w:space="0" w:color="404040"/>
+              <w:right w:val="single" w:sz="8" w:space="0" w:color="404040"/>
+            </w:tcBorders>
+          </w:tcPr>
+          <w:p>
+            <w:pPr>
+              <w:spacing w:before="80" w:after="80"/>
+              <w:jc w:val="center"/>
+            </w:pPr>
+            <w:r>
+              <w:rPr>
+                <w:rFonts w:ascii="Arial" w:hAnsi="Arial"/>
+                <w:b w:val="0"/>
+                <w:color w:val="30302F"/>
+                <w:sz w:val="20"/>
+              </w:rPr>
+            </w:r>
+            <w:r>
+              <w:rPr>
+                <w:rFonts w:ascii="Arial" w:hAnsi="Arial"/>
+                <w:b w:val="0"/>
+                <w:color w:val="30302F"/>
+                <w:sz w:val="20"/>
+              </w:rPr>
+              <w:t>0</w:t>
+            </w:r>
+          </w:p>
+        </w:tc>
+        <w:tc>
+          <w:tcPr>
+            <w:tcW w:type="dxa" w:w="1767"/>
+            <w:tcBorders>
+              <w:top w:val="single" w:sz="8" w:space="0" w:color="404040"/>
+              <w:left w:val="single" w:sz="8" w:space="0" w:color="404040"/>
+              <w:bottom w:val="single" w:sz="8" w:space="0" w:color="404040"/>
+              <w:right w:val="single" w:sz="8" w:space="0" w:color="404040"/>
+            </w:tcBorders>
+          </w:tcPr>
+          <w:p>
+            <w:pPr>
+              <w:spacing w:before="80" w:after="80"/>
+              <w:jc w:val="center"/>
+            </w:pPr>
+            <w:r>
+              <w:rPr>
+                <w:rFonts w:ascii="Arial" w:hAnsi="Arial"/>
+                <w:b w:val="0"/>
+                <w:color w:val="30302F"/>
+                <w:sz w:val="20"/>
+              </w:rPr>
+            </w:r>
+            <w:r>
+              <w:rPr>
+                <w:rFonts w:ascii="Arial" w:hAnsi="Arial"/>
+                <w:b w:val="0"/>
+                <w:color w:val="30302F"/>
+                <w:sz w:val="20"/>
+              </w:rPr>
+              <w:t>1 359 000</w:t>
+            </w:r>
+          </w:p>
+        </w:tc>
+      </w:tr>
+      <w:tr>
+        <w:tc>
+          <w:tcPr>
+            <w:tcW w:type="dxa" w:w="1767"/>
+            <w:tcBorders>
+              <w:top w:val="single" w:sz="8" w:space="0" w:color="404040"/>
+              <w:left w:val="single" w:sz="8" w:space="0" w:color="404040"/>
+              <w:bottom w:val="single" w:sz="8" w:space="0" w:color="404040"/>
+              <w:right w:val="single" w:sz="8" w:space="0" w:color="404040"/>
+            </w:tcBorders>
+            <w:shd w:fill="0A5455" w:val="clear"/>
+          </w:tcPr>
+          <w:p>
+            <w:pPr>
+              <w:spacing w:before="80" w:after="80"/>
+              <w:jc w:val="left"/>
+            </w:pPr>
+            <w:r>
+              <w:rPr>
+                <w:rFonts w:ascii="Arial" w:hAnsi="Arial"/>
+                <w:b/>
+                <w:color w:val="FFFFFF"/>
+                <w:sz w:val="20"/>
+              </w:rPr>
+            </w:r>
+            <w:r>
+              <w:rPr>
+                <w:rFonts w:ascii="Arial" w:hAnsi="Arial"/>
+                <w:b/>
+                <w:color w:val="FFFFFF"/>
+                <w:sz w:val="20"/>
+              </w:rPr>
+              <w:t>Gleaning</w:t>
+            </w:r>
+          </w:p>
+        </w:tc>
+        <w:tc>
+          <w:tcPr>
+            <w:tcW w:type="dxa" w:w="1767"/>
+            <w:tcBorders>
+              <w:top w:val="single" w:sz="8" w:space="0" w:color="404040"/>
+              <w:left w:val="single" w:sz="8" w:space="0" w:color="404040"/>
+              <w:bottom w:val="single" w:sz="8" w:space="0" w:color="404040"/>
+              <w:right w:val="single" w:sz="8" w:space="0" w:color="404040"/>
+            </w:tcBorders>
+          </w:tcPr>
+          <w:p>
+            <w:pPr>
+              <w:spacing w:before="80" w:after="80"/>
+              <w:jc w:val="center"/>
+            </w:pPr>
+            <w:r>
+              <w:rPr>
+                <w:rFonts w:ascii="Arial" w:hAnsi="Arial"/>
+                <w:b w:val="0"/>
+                <w:color w:val="30302F"/>
+                <w:sz w:val="20"/>
+              </w:rPr>
+            </w:r>
+            <w:r>
+              <w:rPr>
+                <w:rFonts w:ascii="Arial" w:hAnsi="Arial"/>
+                <w:b w:val="0"/>
+                <w:color w:val="30302F"/>
+                <w:sz w:val="20"/>
+              </w:rPr>
+              <w:t>Equiv. wage</w:t>
+            </w:r>
+          </w:p>
+        </w:tc>
+        <w:tc>
+          <w:tcPr>
+            <w:tcW w:type="dxa" w:w="1767"/>
+            <w:tcBorders>
+              <w:top w:val="single" w:sz="8" w:space="0" w:color="404040"/>
+              <w:left w:val="single" w:sz="8" w:space="0" w:color="404040"/>
+              <w:bottom w:val="single" w:sz="8" w:space="0" w:color="404040"/>
+              <w:right w:val="single" w:sz="8" w:space="0" w:color="404040"/>
+            </w:tcBorders>
+          </w:tcPr>
+          <w:p>
+            <w:pPr>
+              <w:spacing w:before="80" w:after="80"/>
+              <w:jc w:val="center"/>
+            </w:pPr>
+            <w:r>
+              <w:rPr>
+                <w:rFonts w:ascii="Arial" w:hAnsi="Arial"/>
+                <w:b w:val="0"/>
+                <w:color w:val="30302F"/>
+                <w:sz w:val="20"/>
+              </w:rPr>
+            </w:r>
+            <w:r>
+              <w:rPr>
+                <w:rFonts w:ascii="Arial" w:hAnsi="Arial"/>
+                <w:b w:val="0"/>
+                <w:color w:val="30302F"/>
+                <w:sz w:val="20"/>
+              </w:rPr>
+              <w:t>0</w:t>
+            </w:r>
+          </w:p>
+        </w:tc>
+        <w:tc>
+          <w:tcPr>
+            <w:tcW w:type="dxa" w:w="1767"/>
+            <w:tcBorders>
+              <w:top w:val="single" w:sz="8" w:space="0" w:color="404040"/>
+              <w:left w:val="single" w:sz="8" w:space="0" w:color="404040"/>
+              <w:bottom w:val="single" w:sz="8" w:space="0" w:color="404040"/>
+              <w:right w:val="single" w:sz="8" w:space="0" w:color="404040"/>
+            </w:tcBorders>
+          </w:tcPr>
+          <w:p>
+            <w:pPr>
+              <w:spacing w:before="80" w:after="80"/>
+              <w:jc w:val="center"/>
+            </w:pPr>
+            <w:r>
+              <w:rPr>
+                <w:rFonts w:ascii="Arial" w:hAnsi="Arial"/>
+                <w:b w:val="0"/>
+                <w:color w:val="30302F"/>
+                <w:sz w:val="20"/>
+              </w:rPr>
+            </w:r>
+            <w:r>
+              <w:rPr>
+                <w:rFonts w:ascii="Arial" w:hAnsi="Arial"/>
+                <w:b w:val="0"/>
+                <w:color w:val="30302F"/>
+                <w:sz w:val="20"/>
+              </w:rPr>
+              <w:t>0</w:t>
+            </w:r>
+          </w:p>
+        </w:tc>
+        <w:tc>
+          <w:tcPr>
+            <w:tcW w:type="dxa" w:w="1767"/>
+            <w:tcBorders>
+              <w:top w:val="single" w:sz="8" w:space="0" w:color="404040"/>
+              <w:left w:val="single" w:sz="8" w:space="0" w:color="404040"/>
+              <w:bottom w:val="single" w:sz="8" w:space="0" w:color="404040"/>
+              <w:right w:val="single" w:sz="8" w:space="0" w:color="404040"/>
+            </w:tcBorders>
+          </w:tcPr>
+          <w:p>
+            <w:pPr>
+              <w:spacing w:before="80" w:after="80"/>
+              <w:jc w:val="center"/>
+            </w:pPr>
+            <w:r>
+              <w:rPr>
+                <w:rFonts w:ascii="Arial" w:hAnsi="Arial"/>
+                <w:b w:val="0"/>
+                <w:color w:val="30302F"/>
+                <w:sz w:val="20"/>
+              </w:rPr>
+            </w:r>
+            <w:r>
+              <w:rPr>
+                <w:rFonts w:ascii="Arial" w:hAnsi="Arial"/>
+                <w:b w:val="0"/>
+                <w:color w:val="30302F"/>
+                <w:sz w:val="20"/>
+              </w:rPr>
+              <w:t>63 000</w:t>
+            </w:r>
+          </w:p>
+        </w:tc>
+        <w:tc>
+          <w:tcPr>
+            <w:tcW w:type="dxa" w:w="1767"/>
+            <w:tcBorders>
+              <w:top w:val="single" w:sz="8" w:space="0" w:color="404040"/>
+              <w:left w:val="single" w:sz="8" w:space="0" w:color="404040"/>
+              <w:bottom w:val="single" w:sz="8" w:space="0" w:color="404040"/>
+              <w:right w:val="single" w:sz="8" w:space="0" w:color="404040"/>
+            </w:tcBorders>
+          </w:tcPr>
+          <w:p>
+            <w:pPr>
+              <w:spacing w:before="80" w:after="80"/>
+              <w:jc w:val="center"/>
+            </w:pPr>
+            <w:r>
+              <w:rPr>
+                <w:rFonts w:ascii="Arial" w:hAnsi="Arial"/>
+                <w:b w:val="0"/>
+                <w:color w:val="30302F"/>
+                <w:sz w:val="20"/>
+              </w:rPr>
+            </w:r>
+            <w:r>
+              <w:rPr>
+                <w:rFonts w:ascii="Arial" w:hAnsi="Arial"/>
+                <w:b w:val="0"/>
+                <w:color w:val="30302F"/>
+                <w:sz w:val="20"/>
+              </w:rPr>
+              <w:t>0</w:t>
+            </w:r>
+          </w:p>
+        </w:tc>
+        <w:tc>
+          <w:tcPr>
+            <w:tcW w:type="dxa" w:w="1767"/>
+            <w:tcBorders>
+              <w:top w:val="single" w:sz="8" w:space="0" w:color="404040"/>
+              <w:left w:val="single" w:sz="8" w:space="0" w:color="404040"/>
+              <w:bottom w:val="single" w:sz="8" w:space="0" w:color="404040"/>
+              <w:right w:val="single" w:sz="8" w:space="0" w:color="404040"/>
+            </w:tcBorders>
+          </w:tcPr>
+          <w:p>
+            <w:pPr>
+              <w:spacing w:before="80" w:after="80"/>
+              <w:jc w:val="center"/>
+            </w:pPr>
+            <w:r>
+              <w:rPr>
+                <w:rFonts w:ascii="Arial" w:hAnsi="Arial"/>
+                <w:b w:val="0"/>
+                <w:color w:val="30302F"/>
+                <w:sz w:val="20"/>
+              </w:rPr>
+            </w:r>
+            <w:r>
+              <w:rPr>
+                <w:rFonts w:ascii="Arial" w:hAnsi="Arial"/>
+                <w:b w:val="0"/>
+                <w:color w:val="30302F"/>
+                <w:sz w:val="20"/>
+              </w:rPr>
+              <w:t>0</w:t>
+            </w:r>
+          </w:p>
+        </w:tc>
+        <w:tc>
+          <w:tcPr>
+            <w:tcW w:type="dxa" w:w="1767"/>
+            <w:tcBorders>
+              <w:top w:val="single" w:sz="8" w:space="0" w:color="404040"/>
+              <w:left w:val="single" w:sz="8" w:space="0" w:color="404040"/>
+              <w:bottom w:val="single" w:sz="8" w:space="0" w:color="404040"/>
+              <w:right w:val="single" w:sz="8" w:space="0" w:color="404040"/>
+            </w:tcBorders>
+          </w:tcPr>
+          <w:p>
+            <w:pPr>
+              <w:spacing w:before="80" w:after="80"/>
+              <w:jc w:val="center"/>
+            </w:pPr>
+            <w:r>
+              <w:rPr>
+                <w:rFonts w:ascii="Arial" w:hAnsi="Arial"/>
+                <w:b w:val="0"/>
+                <w:color w:val="30302F"/>
+                <w:sz w:val="20"/>
+              </w:rPr>
+            </w:r>
+            <w:r>
+              <w:rPr>
+                <w:rFonts w:ascii="Arial" w:hAnsi="Arial"/>
+                <w:b w:val="0"/>
+                <w:color w:val="30302F"/>
+                <w:sz w:val="20"/>
+              </w:rPr>
+              <w:t>63 000</w:t>
+            </w:r>
+          </w:p>
+        </w:tc>
+      </w:tr>
+      <w:tr>
+        <w:tc>
+          <w:tcPr>
+            <w:tcW w:type="dxa" w:w="1767"/>
+            <w:tcBorders>
+              <w:top w:val="single" w:sz="8" w:space="0" w:color="404040"/>
+              <w:left w:val="single" w:sz="8" w:space="0" w:color="404040"/>
+              <w:bottom w:val="single" w:sz="8" w:space="0" w:color="404040"/>
+              <w:right w:val="single" w:sz="8" w:space="0" w:color="404040"/>
+            </w:tcBorders>
+            <w:shd w:fill="3B9C7B" w:val="clear"/>
+          </w:tcPr>
+          <w:p>
+            <w:pPr>
+              <w:spacing w:before="80" w:after="80"/>
+              <w:jc w:val="left"/>
+            </w:pPr>
+            <w:r>
+              <w:rPr>
+                <w:rFonts w:ascii="Arial" w:hAnsi="Arial"/>
+                <w:b/>
+                <w:color w:val="FFFFFF"/>
+                <w:sz w:val="20"/>
+              </w:rPr>
+            </w:r>
+            <w:r>
+              <w:rPr>
+                <w:rFonts w:ascii="Arial" w:hAnsi="Arial"/>
+                <w:b/>
+                <w:color w:val="FFFFFF"/>
+                <w:sz w:val="20"/>
+              </w:rPr>
+              <w:t>Total</w:t>
+            </w:r>
+          </w:p>
+        </w:tc>
+        <w:tc>
+          <w:tcPr>
+            <w:tcW w:type="dxa" w:w="1767"/>
+            <w:tcBorders>
+              <w:top w:val="single" w:sz="8" w:space="0" w:color="404040"/>
+              <w:left w:val="single" w:sz="8" w:space="0" w:color="404040"/>
+              <w:bottom w:val="single" w:sz="8" w:space="0" w:color="404040"/>
+              <w:right w:val="single" w:sz="8" w:space="0" w:color="404040"/>
+            </w:tcBorders>
+            <w:shd w:fill="3B9C7B" w:val="clear"/>
+          </w:tcPr>
+          <w:p>
+            <w:pPr>
+              <w:spacing w:before="80" w:after="80"/>
+              <w:jc w:val="center"/>
+            </w:pPr>
+            <w:r>
+              <w:rPr>
+                <w:rFonts w:ascii="Arial" w:hAnsi="Arial"/>
+                <w:b/>
+                <w:color w:val="FFFFFF"/>
+                <w:sz w:val="20"/>
+              </w:rPr>
+            </w:r>
+            <w:r>
+              <w:rPr>
+                <w:rFonts w:ascii="Arial" w:hAnsi="Arial"/>
+                <w:b/>
+                <w:color w:val="FFFFFF"/>
+                <w:sz w:val="20"/>
+              </w:rPr>
+            </w:r>
+          </w:p>
+        </w:tc>
+        <w:tc>
+          <w:tcPr>
+            <w:tcW w:type="dxa" w:w="1767"/>
+            <w:tcBorders>
+              <w:top w:val="single" w:sz="8" w:space="0" w:color="404040"/>
+              <w:left w:val="single" w:sz="8" w:space="0" w:color="404040"/>
+              <w:bottom w:val="single" w:sz="8" w:space="0" w:color="404040"/>
+              <w:right w:val="single" w:sz="8" w:space="0" w:color="404040"/>
+            </w:tcBorders>
+            <w:shd w:fill="3B9C7B" w:val="clear"/>
+          </w:tcPr>
+          <w:p>
+            <w:pPr>
+              <w:spacing w:before="80" w:after="80"/>
+              <w:jc w:val="center"/>
+            </w:pPr>
+            <w:r>
+              <w:rPr>
+                <w:rFonts w:ascii="Arial" w:hAnsi="Arial"/>
+                <w:b/>
+                <w:color w:val="FFFFFF"/>
+                <w:sz w:val="20"/>
+              </w:rPr>
+            </w:r>
+            <w:r>
+              <w:rPr>
+                <w:rFonts w:ascii="Arial" w:hAnsi="Arial"/>
+                <w:b/>
+                <w:color w:val="FFFFFF"/>
+                <w:sz w:val="20"/>
+              </w:rPr>
+              <w:t>337 750</w:t>
+            </w:r>
+          </w:p>
+        </w:tc>
+        <w:tc>
+          <w:tcPr>
+            <w:tcW w:type="dxa" w:w="1767"/>
+            <w:tcBorders>
+              <w:top w:val="single" w:sz="8" w:space="0" w:color="404040"/>
+              <w:left w:val="single" w:sz="8" w:space="0" w:color="404040"/>
+              <w:bottom w:val="single" w:sz="8" w:space="0" w:color="404040"/>
+              <w:right w:val="single" w:sz="8" w:space="0" w:color="404040"/>
+            </w:tcBorders>
+            <w:shd w:fill="3B9C7B" w:val="clear"/>
+          </w:tcPr>
+          <w:p>
+            <w:pPr>
+              <w:spacing w:before="80" w:after="80"/>
+              <w:jc w:val="center"/>
+            </w:pPr>
+            <w:r>
+              <w:rPr>
+                <w:rFonts w:ascii="Arial" w:hAnsi="Arial"/>
+                <w:b/>
+                <w:color w:val="FFFFFF"/>
+                <w:sz w:val="20"/>
+              </w:rPr>
+            </w:r>
+            <w:r>
+              <w:rPr>
+                <w:rFonts w:ascii="Arial" w:hAnsi="Arial"/>
+                <w:b/>
+                <w:color w:val="FFFFFF"/>
+                <w:sz w:val="20"/>
+              </w:rPr>
+              <w:t>1 275 000</w:t>
+            </w:r>
+          </w:p>
+        </w:tc>
+        <w:tc>
+          <w:tcPr>
+            <w:tcW w:type="dxa" w:w="1767"/>
+            <w:tcBorders>
+              <w:top w:val="single" w:sz="8" w:space="0" w:color="404040"/>
+              <w:left w:val="single" w:sz="8" w:space="0" w:color="404040"/>
+              <w:bottom w:val="single" w:sz="8" w:space="0" w:color="404040"/>
+              <w:right w:val="single" w:sz="8" w:space="0" w:color="404040"/>
+            </w:tcBorders>
+            <w:shd w:fill="3B9C7B" w:val="clear"/>
+          </w:tcPr>
+          <w:p>
+            <w:pPr>
+              <w:spacing w:before="80" w:after="80"/>
+              <w:jc w:val="center"/>
+            </w:pPr>
+            <w:r>
+              <w:rPr>
+                <w:rFonts w:ascii="Arial" w:hAnsi="Arial"/>
+                <w:b/>
+                <w:color w:val="FFFFFF"/>
+                <w:sz w:val="20"/>
+              </w:rPr>
+            </w:r>
+            <w:r>
+              <w:rPr>
+                <w:rFonts w:ascii="Arial" w:hAnsi="Arial"/>
+                <w:b/>
+                <w:color w:val="FFFFFF"/>
+                <w:sz w:val="20"/>
+              </w:rPr>
+              <w:t>1 027 000</w:t>
+            </w:r>
+          </w:p>
+        </w:tc>
+        <w:tc>
+          <w:tcPr>
+            <w:tcW w:type="dxa" w:w="1767"/>
+            <w:tcBorders>
+              <w:top w:val="single" w:sz="8" w:space="0" w:color="404040"/>
+              <w:left w:val="single" w:sz="8" w:space="0" w:color="404040"/>
+              <w:bottom w:val="single" w:sz="8" w:space="0" w:color="404040"/>
+              <w:right w:val="single" w:sz="8" w:space="0" w:color="404040"/>
+            </w:tcBorders>
+            <w:shd w:fill="3B9C7B" w:val="clear"/>
+          </w:tcPr>
+          <w:p>
+            <w:pPr>
+              <w:spacing w:before="80" w:after="80"/>
+              <w:jc w:val="center"/>
+            </w:pPr>
+            <w:r>
+              <w:rPr>
+                <w:rFonts w:ascii="Arial" w:hAnsi="Arial"/>
+                <w:b/>
+                <w:color w:val="FFFFFF"/>
+                <w:sz w:val="20"/>
+              </w:rPr>
+            </w:r>
+            <w:r>
+              <w:rPr>
+                <w:rFonts w:ascii="Arial" w:hAnsi="Arial"/>
+                <w:b/>
+                <w:color w:val="FFFFFF"/>
+                <w:sz w:val="20"/>
+              </w:rPr>
+              <w:t>495 000</w:t>
+            </w:r>
+          </w:p>
+        </w:tc>
+        <w:tc>
+          <w:tcPr>
+            <w:tcW w:type="dxa" w:w="1767"/>
+            <w:tcBorders>
+              <w:top w:val="single" w:sz="8" w:space="0" w:color="404040"/>
+              <w:left w:val="single" w:sz="8" w:space="0" w:color="404040"/>
+              <w:bottom w:val="single" w:sz="8" w:space="0" w:color="404040"/>
+              <w:right w:val="single" w:sz="8" w:space="0" w:color="404040"/>
+            </w:tcBorders>
+            <w:shd w:fill="3B9C7B" w:val="clear"/>
+          </w:tcPr>
+          <w:p>
+            <w:pPr>
+              <w:spacing w:before="80" w:after="80"/>
+              <w:jc w:val="center"/>
+            </w:pPr>
+            <w:r>
+              <w:rPr>
+                <w:rFonts w:ascii="Arial" w:hAnsi="Arial"/>
+                <w:b/>
+                <w:color w:val="FFFFFF"/>
+                <w:sz w:val="20"/>
+              </w:rPr>
+            </w:r>
+            <w:r>
+              <w:rPr>
+                <w:rFonts w:ascii="Arial" w:hAnsi="Arial"/>
+                <w:b/>
+                <w:color w:val="FFFFFF"/>
+                <w:sz w:val="20"/>
+              </w:rPr>
+              <w:t>119 085</w:t>
+            </w:r>
+          </w:p>
+        </w:tc>
+        <w:tc>
+          <w:tcPr>
+            <w:tcW w:type="dxa" w:w="1767"/>
+            <w:tcBorders>
+              <w:top w:val="single" w:sz="8" w:space="0" w:color="404040"/>
+              <w:left w:val="single" w:sz="8" w:space="0" w:color="404040"/>
+              <w:bottom w:val="single" w:sz="8" w:space="0" w:color="404040"/>
+              <w:right w:val="single" w:sz="8" w:space="0" w:color="404040"/>
+            </w:tcBorders>
+            <w:shd w:fill="3B9C7B" w:val="clear"/>
+          </w:tcPr>
+          <w:p>
+            <w:pPr>
+              <w:spacing w:before="80" w:after="80"/>
+              <w:jc w:val="center"/>
+            </w:pPr>
+            <w:r>
+              <w:rPr>
+                <w:rFonts w:ascii="Arial" w:hAnsi="Arial"/>
+                <w:b/>
+                <w:color w:val="FFFFFF"/>
+                <w:sz w:val="20"/>
+              </w:rPr>
+            </w:r>
+            <w:r>
+              <w:rPr>
+                <w:rFonts w:ascii="Arial" w:hAnsi="Arial"/>
+                <w:b/>
+                <w:color w:val="FFFFFF"/>
+                <w:sz w:val="20"/>
+              </w:rPr>
+              <w:t>3 253 835</w:t>
+            </w:r>
+          </w:p>
+        </w:tc>
+      </w:tr>
+    </w:tbl>
+    <w:p>
+      <w:pPr>
+        <w:spacing w:before="80" w:after="80"/>
+        <w:jc w:val="left"/>
+      </w:pPr>
+      <w:r>
+        <w:rPr>
+          <w:i/>
+        </w:rPr>
+        <w:t>Tourism sector receives the most value (39%). Coastal households receive 32% (protection + gleaning + mangrove recreation).</w:t>
+      </w:r>
+    </w:p>
     <w:sectPr>
       <w:pgSz w:w="15840" w:h="12240"/>
       <w:pgMar w:top="850" w:right="850" w:bottom="850" w:left="850" w:header="720" w:footer="720" w:gutter="0"/>

</xml_diff>